<commit_message>
adds: a date updated line at the bottom of the resumes
</commit_message>
<xml_diff>
--- a/docx/Atkinson_Academic.docx
+++ b/docx/Atkinson_Academic.docx
@@ -4014,6 +4014,14 @@
       </w:r>
     </w:p>
     <w:bookmarkEnd w:id="45"/>
+    <w:p>
+      <w:pPr>
+        <w:pStyle w:val="FirstParagraph"/>
+      </w:pPr>
+      <w:r>
+        <w:t xml:space="preserve">updated: 5 May 2026</w:t>
+      </w:r>
+    </w:p>
     <w:sectPr/>
   </w:body>
 </w:document>

</xml_diff>

<commit_message>
adds: style improved docx docs
</commit_message>
<xml_diff>
--- a/docx/Atkinson_Academic.docx
+++ b/docx/Atkinson_Academic.docx
@@ -7,7 +7,25 @@
         <w:pStyle w:val="Title"/>
       </w:pPr>
       <w:r>
-        <w:t xml:space="preserve">Andrew Atkinson — Academic Resume</w:t>
+        <w:t xml:space="preserve">Andrew</w:t>
+      </w:r>
+      <w:r>
+        <w:t xml:space="preserve"> </w:t>
+      </w:r>
+      <w:r>
+        <w:t xml:space="preserve">Atkinson</w:t>
+      </w:r>
+      <w:r>
+        <w:t xml:space="preserve"> </w:t>
+      </w:r>
+      <w:r>
+        <w:t xml:space="preserve">—</w:t>
+      </w:r>
+      <w:r>
+        <w:t xml:space="preserve"> </w:t>
+      </w:r>
+      <w:r>
+        <w:t xml:space="preserve">CV</w:t>
       </w:r>
     </w:p>
     <w:bookmarkStart w:id="24" w:name="andrew-atkinson"/>
@@ -23,6 +41,12 @@
       <w:pPr>
         <w:pStyle w:val="FirstParagraph"/>
       </w:pPr>
+      <w:r>
+        <w:t xml:space="preserve">Email:</w:t>
+      </w:r>
+      <w:r>
+        <w:t xml:space="preserve"> </w:t>
+      </w:r>
       <w:hyperlink r:id="rId20">
         <w:r>
           <w:rPr>
@@ -31,6 +55,14 @@
           <w:t xml:space="preserve">blind.sam@gmail.com</w:t>
         </w:r>
       </w:hyperlink>
+    </w:p>
+    <w:p>
+      <w:pPr>
+        <w:pStyle w:val="BodyText"/>
+      </w:pPr>
+      <w:r>
+        <w:t xml:space="preserve">Tel:</w:t>
+      </w:r>
       <w:r>
         <w:t xml:space="preserve"> </w:t>
       </w:r>
@@ -42,6 +74,14 @@
           <w:t xml:space="preserve">646 243 5179</w:t>
         </w:r>
       </w:hyperlink>
+    </w:p>
+    <w:p>
+      <w:pPr>
+        <w:pStyle w:val="BodyText"/>
+      </w:pPr>
+      <w:r>
+        <w:t xml:space="preserve">Web:</w:t>
+      </w:r>
       <w:r>
         <w:t xml:space="preserve"> </w:t>
       </w:r>
@@ -53,6 +93,14 @@
           <w:t xml:space="preserve">andrewatkinson.net</w:t>
         </w:r>
       </w:hyperlink>
+    </w:p>
+    <w:p>
+      <w:pPr>
+        <w:pStyle w:val="BodyText"/>
+      </w:pPr>
+      <w:r>
+        <w:t xml:space="preserve">LinkedIn:</w:t>
+      </w:r>
       <w:r>
         <w:t xml:space="preserve"> </w:t>
       </w:r>
@@ -126,7 +174,11 @@
           <w:tblHeader w:val="true"/>
         </w:trPr>
         <w:tc>
-          <w:tcPr/>
+          <w:tcPr>
+            <w:tcBorders>
+              <w:bottom w:val="single" w:sz="4" w:space="0" w:color="cccccc"/>
+            </w:tcBorders>
+          </w:tcPr>
           <w:p>
             <w:pPr>
               <w:pStyle w:val="Compact"/>
@@ -138,7 +190,11 @@
           </w:p>
         </w:tc>
         <w:tc>
-          <w:tcPr/>
+          <w:tcPr>
+            <w:tcBorders>
+              <w:bottom w:val="single" w:sz="4" w:space="0" w:color="cccccc"/>
+            </w:tcBorders>
+          </w:tcPr>
           <w:p>
             <w:pPr>
               <w:pStyle w:val="Compact"/>
@@ -150,7 +206,11 @@
           </w:p>
         </w:tc>
         <w:tc>
-          <w:tcPr/>
+          <w:tcPr>
+            <w:tcBorders>
+              <w:bottom w:val="single" w:sz="4" w:space="0" w:color="cccccc"/>
+            </w:tcBorders>
+          </w:tcPr>
           <w:p>
             <w:pPr>
               <w:pStyle w:val="Compact"/>
@@ -336,6 +396,10 @@
         <w:pStyle w:val="FirstParagraph"/>
       </w:pPr>
       <w:r>
+        <w:rPr>
+          <w:bCs/>
+          <w:b/>
+        </w:rPr>
         <w:t xml:space="preserve">Montclair State University, Montclair, NJ</w:t>
       </w:r>
       <w:r>
@@ -357,11 +421,7 @@
     </w:p>
     <w:p>
       <w:pPr>
-        <w:numPr>
-          <w:ilvl w:val="0"/>
-          <w:numId w:val="1001"/>
-        </w:numPr>
-        <w:pStyle w:val="Compact"/>
+        <w:pStyle w:val="BodyText"/>
       </w:pPr>
       <w:r>
         <w:t xml:space="preserve">Deputy Chair, Dept. of Art and Design, September 2019 – May 2023</w:t>
@@ -369,11 +429,7 @@
     </w:p>
     <w:p>
       <w:pPr>
-        <w:numPr>
-          <w:ilvl w:val="0"/>
-          <w:numId w:val="1001"/>
-        </w:numPr>
-        <w:pStyle w:val="Compact"/>
+        <w:pStyle w:val="BodyText"/>
       </w:pPr>
       <w:r>
         <w:t xml:space="preserve">Assistant Professor of Digital Photography, September 2004 – Present</w:t>
@@ -381,11 +437,7 @@
     </w:p>
     <w:p>
       <w:pPr>
-        <w:numPr>
-          <w:ilvl w:val="0"/>
-          <w:numId w:val="1001"/>
-        </w:numPr>
-        <w:pStyle w:val="Compact"/>
+        <w:pStyle w:val="BodyText"/>
       </w:pPr>
       <w:r>
         <w:t xml:space="preserve">Department of Art and Design Summer Chair, Summers 2014–17, 2019–24</w:t>
@@ -393,11 +445,7 @@
     </w:p>
     <w:p>
       <w:pPr>
-        <w:numPr>
-          <w:ilvl w:val="0"/>
-          <w:numId w:val="1001"/>
-        </w:numPr>
-        <w:pStyle w:val="Compact"/>
+        <w:pStyle w:val="BodyText"/>
       </w:pPr>
       <w:r>
         <w:t xml:space="preserve">Director of the MFA in Studio Arts, Sept 2009 – Jan 2017</w:t>
@@ -405,9 +453,13 @@
     </w:p>
     <w:p>
       <w:pPr>
-        <w:pStyle w:val="FirstParagraph"/>
-      </w:pPr>
-      <w:r>
+        <w:pStyle w:val="BodyText"/>
+      </w:pPr>
+      <w:r>
+        <w:rPr>
+          <w:bCs/>
+          <w:b/>
+        </w:rPr>
         <w:t xml:space="preserve">Vidcode — Curriculum Developer</w:t>
       </w:r>
       <w:r>
@@ -429,11 +481,7 @@
     </w:p>
     <w:p>
       <w:pPr>
-        <w:numPr>
-          <w:ilvl w:val="0"/>
-          <w:numId w:val="1002"/>
-        </w:numPr>
-        <w:pStyle w:val="Compact"/>
+        <w:pStyle w:val="BodyText"/>
       </w:pPr>
       <w:r>
         <w:t xml:space="preserve">Developed curriculum for introductory creative coding courses including for Girl Scouts and BrainPop</w:t>
@@ -441,9 +489,13 @@
     </w:p>
     <w:p>
       <w:pPr>
-        <w:pStyle w:val="FirstParagraph"/>
-      </w:pPr>
-      <w:r>
+        <w:pStyle w:val="BodyText"/>
+      </w:pPr>
+      <w:r>
+        <w:rPr>
+          <w:bCs/>
+          <w:b/>
+        </w:rPr>
         <w:t xml:space="preserve">Institute for the Advancement of Philosophy for Children</w:t>
       </w:r>
       <w:r>
@@ -465,11 +517,7 @@
     </w:p>
     <w:p>
       <w:pPr>
-        <w:numPr>
-          <w:ilvl w:val="0"/>
-          <w:numId w:val="1003"/>
-        </w:numPr>
-        <w:pStyle w:val="Compact"/>
+        <w:pStyle w:val="BodyText"/>
       </w:pPr>
       <w:r>
         <w:t xml:space="preserve">Updated novel design for accessibility and digital access</w:t>
@@ -511,7 +559,11 @@
           <w:tblHeader w:val="true"/>
         </w:trPr>
         <w:tc>
-          <w:tcPr/>
+          <w:tcPr>
+            <w:tcBorders>
+              <w:bottom w:val="single" w:sz="4" w:space="0" w:color="cccccc"/>
+            </w:tcBorders>
+          </w:tcPr>
           <w:p>
             <w:pPr>
               <w:pStyle w:val="Compact"/>
@@ -523,7 +575,11 @@
           </w:p>
         </w:tc>
         <w:tc>
-          <w:tcPr/>
+          <w:tcPr>
+            <w:tcBorders>
+              <w:bottom w:val="single" w:sz="4" w:space="0" w:color="cccccc"/>
+            </w:tcBorders>
+          </w:tcPr>
           <w:p>
             <w:pPr>
               <w:pStyle w:val="Compact"/>
@@ -535,7 +591,11 @@
           </w:p>
         </w:tc>
         <w:tc>
-          <w:tcPr/>
+          <w:tcPr>
+            <w:tcBorders>
+              <w:bottom w:val="single" w:sz="4" w:space="0" w:color="cccccc"/>
+            </w:tcBorders>
+          </w:tcPr>
           <w:p>
             <w:pPr>
               <w:pStyle w:val="Compact"/>
@@ -727,7 +787,11 @@
           <w:tblHeader w:val="true"/>
         </w:trPr>
         <w:tc>
-          <w:tcPr/>
+          <w:tcPr>
+            <w:tcBorders>
+              <w:bottom w:val="single" w:sz="4" w:space="0" w:color="cccccc"/>
+            </w:tcBorders>
+          </w:tcPr>
           <w:p>
             <w:pPr>
               <w:pStyle w:val="Compact"/>
@@ -739,7 +803,11 @@
           </w:p>
         </w:tc>
         <w:tc>
-          <w:tcPr/>
+          <w:tcPr>
+            <w:tcBorders>
+              <w:bottom w:val="single" w:sz="4" w:space="0" w:color="cccccc"/>
+            </w:tcBorders>
+          </w:tcPr>
           <w:p>
             <w:pPr>
               <w:pStyle w:val="Compact"/>
@@ -751,7 +819,11 @@
           </w:p>
         </w:tc>
         <w:tc>
-          <w:tcPr/>
+          <w:tcPr>
+            <w:tcBorders>
+              <w:bottom w:val="single" w:sz="4" w:space="0" w:color="cccccc"/>
+            </w:tcBorders>
+          </w:tcPr>
           <w:p>
             <w:pPr>
               <w:pStyle w:val="Compact"/>
@@ -943,7 +1015,11 @@
           <w:tblHeader w:val="true"/>
         </w:trPr>
         <w:tc>
-          <w:tcPr/>
+          <w:tcPr>
+            <w:tcBorders>
+              <w:bottom w:val="single" w:sz="4" w:space="0" w:color="cccccc"/>
+            </w:tcBorders>
+          </w:tcPr>
           <w:p>
             <w:pPr>
               <w:pStyle w:val="Compact"/>
@@ -955,7 +1031,11 @@
           </w:p>
         </w:tc>
         <w:tc>
-          <w:tcPr/>
+          <w:tcPr>
+            <w:tcBorders>
+              <w:bottom w:val="single" w:sz="4" w:space="0" w:color="cccccc"/>
+            </w:tcBorders>
+          </w:tcPr>
           <w:p>
             <w:pPr>
               <w:pStyle w:val="Compact"/>
@@ -967,7 +1047,11 @@
           </w:p>
         </w:tc>
         <w:tc>
-          <w:tcPr/>
+          <w:tcPr>
+            <w:tcBorders>
+              <w:bottom w:val="single" w:sz="4" w:space="0" w:color="cccccc"/>
+            </w:tcBorders>
+          </w:tcPr>
           <w:p>
             <w:pPr>
               <w:pStyle w:val="Compact"/>
@@ -1083,7 +1167,11 @@
           <w:tblHeader w:val="true"/>
         </w:trPr>
         <w:tc>
-          <w:tcPr/>
+          <w:tcPr>
+            <w:tcBorders>
+              <w:bottom w:val="single" w:sz="4" w:space="0" w:color="cccccc"/>
+            </w:tcBorders>
+          </w:tcPr>
           <w:p>
             <w:pPr>
               <w:pStyle w:val="Compact"/>
@@ -1095,7 +1183,11 @@
           </w:p>
         </w:tc>
         <w:tc>
-          <w:tcPr/>
+          <w:tcPr>
+            <w:tcBorders>
+              <w:bottom w:val="single" w:sz="4" w:space="0" w:color="cccccc"/>
+            </w:tcBorders>
+          </w:tcPr>
           <w:p>
             <w:pPr>
               <w:pStyle w:val="Compact"/>
@@ -1107,7 +1199,11 @@
           </w:p>
         </w:tc>
         <w:tc>
-          <w:tcPr/>
+          <w:tcPr>
+            <w:tcBorders>
+              <w:bottom w:val="single" w:sz="4" w:space="0" w:color="cccccc"/>
+            </w:tcBorders>
+          </w:tcPr>
           <w:p>
             <w:pPr>
               <w:pStyle w:val="Compact"/>
@@ -1212,6 +1308,10 @@
         <w:pStyle w:val="FirstParagraph"/>
       </w:pPr>
       <w:r>
+        <w:rPr>
+          <w:bCs/>
+          <w:b/>
+        </w:rPr>
         <w:t xml:space="preserve">Curriculum Committee</w:t>
       </w:r>
     </w:p>
@@ -1228,6 +1328,10 @@
         <w:pStyle w:val="BodyText"/>
       </w:pPr>
       <w:r>
+        <w:rPr>
+          <w:bCs/>
+          <w:b/>
+        </w:rPr>
         <w:t xml:space="preserve">DPAC/Search Committees</w:t>
       </w:r>
     </w:p>
@@ -1244,6 +1348,10 @@
         <w:pStyle w:val="BodyText"/>
       </w:pPr>
       <w:r>
+        <w:rPr>
+          <w:bCs/>
+          <w:b/>
+        </w:rPr>
         <w:t xml:space="preserve">Open Houses/Arts Days/Recruitment</w:t>
       </w:r>
     </w:p>
@@ -1260,6 +1368,10 @@
         <w:pStyle w:val="BodyText"/>
       </w:pPr>
       <w:r>
+        <w:rPr>
+          <w:bCs/>
+          <w:b/>
+        </w:rPr>
         <w:t xml:space="preserve">Convocation Committee</w:t>
       </w:r>
     </w:p>
@@ -1276,6 +1388,10 @@
         <w:pStyle w:val="BodyText"/>
       </w:pPr>
       <w:r>
+        <w:rPr>
+          <w:bCs/>
+          <w:b/>
+        </w:rPr>
         <w:t xml:space="preserve">Scholarship Committees</w:t>
       </w:r>
     </w:p>
@@ -1292,6 +1408,10 @@
         <w:pStyle w:val="BodyText"/>
       </w:pPr>
       <w:r>
+        <w:rPr>
+          <w:bCs/>
+          <w:b/>
+        </w:rPr>
         <w:t xml:space="preserve">MFA Director</w:t>
       </w:r>
     </w:p>
@@ -1308,6 +1428,10 @@
         <w:pStyle w:val="BodyText"/>
       </w:pPr>
       <w:r>
+        <w:rPr>
+          <w:bCs/>
+          <w:b/>
+        </w:rPr>
         <w:t xml:space="preserve">Deputy Chair/Summer Chair</w:t>
       </w:r>
     </w:p>
@@ -1334,6 +1458,10 @@
         <w:pStyle w:val="FirstParagraph"/>
       </w:pPr>
       <w:r>
+        <w:rPr>
+          <w:bCs/>
+          <w:b/>
+        </w:rPr>
         <w:t xml:space="preserve">Passaic Public Schools Digital Art CTE Advisory Committee</w:t>
       </w:r>
     </w:p>
@@ -1350,16 +1478,16 @@
         <w:pStyle w:val="BodyText"/>
       </w:pPr>
       <w:r>
+        <w:rPr>
+          <w:bCs/>
+          <w:b/>
+        </w:rPr>
         <w:t xml:space="preserve">Conference Organiser</w:t>
       </w:r>
     </w:p>
     <w:p>
       <w:pPr>
-        <w:numPr>
-          <w:ilvl w:val="0"/>
-          <w:numId w:val="1004"/>
-        </w:numPr>
-        <w:pStyle w:val="Compact"/>
+        <w:pStyle w:val="BodyText"/>
       </w:pPr>
       <w:r>
         <w:t xml:space="preserve">2023 —</w:t>
@@ -1373,11 +1501,7 @@
     </w:p>
     <w:p>
       <w:pPr>
-        <w:numPr>
-          <w:ilvl w:val="0"/>
-          <w:numId w:val="1004"/>
-        </w:numPr>
-        <w:pStyle w:val="Compact"/>
+        <w:pStyle w:val="BodyText"/>
       </w:pPr>
       <w:r>
         <w:t xml:space="preserve">2022 —</w:t>
@@ -1391,11 +1515,7 @@
     </w:p>
     <w:p>
       <w:pPr>
-        <w:numPr>
-          <w:ilvl w:val="0"/>
-          <w:numId w:val="1004"/>
-        </w:numPr>
-        <w:pStyle w:val="Compact"/>
+        <w:pStyle w:val="BodyText"/>
       </w:pPr>
       <w:r>
         <w:t xml:space="preserve">2009 —</w:t>
@@ -1409,11 +1529,7 @@
     </w:p>
     <w:p>
       <w:pPr>
-        <w:numPr>
-          <w:ilvl w:val="0"/>
-          <w:numId w:val="1004"/>
-        </w:numPr>
-        <w:pStyle w:val="Compact"/>
+        <w:pStyle w:val="BodyText"/>
       </w:pPr>
       <w:r>
         <w:t xml:space="preserve">2008 —</w:t>
@@ -1427,11 +1543,7 @@
     </w:p>
     <w:p>
       <w:pPr>
-        <w:numPr>
-          <w:ilvl w:val="0"/>
-          <w:numId w:val="1004"/>
-        </w:numPr>
-        <w:pStyle w:val="Compact"/>
+        <w:pStyle w:val="BodyText"/>
       </w:pPr>
       <w:r>
         <w:t xml:space="preserve">2007 —</w:t>
@@ -1445,19 +1557,19 @@
     </w:p>
     <w:p>
       <w:pPr>
-        <w:pStyle w:val="FirstParagraph"/>
-      </w:pPr>
-      <w:r>
+        <w:pStyle w:val="BodyText"/>
+      </w:pPr>
+      <w:r>
+        <w:rPr>
+          <w:bCs/>
+          <w:b/>
+        </w:rPr>
         <w:t xml:space="preserve">External Reviewer</w:t>
       </w:r>
     </w:p>
     <w:p>
       <w:pPr>
-        <w:numPr>
-          <w:ilvl w:val="0"/>
-          <w:numId w:val="1005"/>
-        </w:numPr>
-        <w:pStyle w:val="Compact"/>
+        <w:pStyle w:val="BodyText"/>
       </w:pPr>
       <w:r>
         <w:t xml:space="preserve">2012 —</w:t>
@@ -1471,19 +1583,19 @@
     </w:p>
     <w:p>
       <w:pPr>
-        <w:pStyle w:val="FirstParagraph"/>
-      </w:pPr>
-      <w:r>
+        <w:pStyle w:val="BodyText"/>
+      </w:pPr>
+      <w:r>
+        <w:rPr>
+          <w:bCs/>
+          <w:b/>
+        </w:rPr>
         <w:t xml:space="preserve">Juror</w:t>
       </w:r>
     </w:p>
     <w:p>
       <w:pPr>
-        <w:numPr>
-          <w:ilvl w:val="0"/>
-          <w:numId w:val="1006"/>
-        </w:numPr>
-        <w:pStyle w:val="Compact"/>
+        <w:pStyle w:val="BodyText"/>
       </w:pPr>
       <w:r>
         <w:t xml:space="preserve">2008 —</w:t>
@@ -1516,11 +1628,7 @@
     </w:p>
     <w:p>
       <w:pPr>
-        <w:numPr>
-          <w:ilvl w:val="0"/>
-          <w:numId w:val="1007"/>
-        </w:numPr>
-        <w:pStyle w:val="Compact"/>
+        <w:pStyle w:val="FirstParagraph"/>
       </w:pPr>
       <w:r>
         <w:t xml:space="preserve">2025 —</w:t>
@@ -1571,11 +1679,7 @@
     </w:p>
     <w:p>
       <w:pPr>
-        <w:numPr>
-          <w:ilvl w:val="0"/>
-          <w:numId w:val="1007"/>
-        </w:numPr>
-        <w:pStyle w:val="Compact"/>
+        <w:pStyle w:val="BodyText"/>
       </w:pPr>
       <w:r>
         <w:t xml:space="preserve">2017 —</w:t>
@@ -1589,11 +1693,7 @@
     </w:p>
     <w:p>
       <w:pPr>
-        <w:numPr>
-          <w:ilvl w:val="0"/>
-          <w:numId w:val="1007"/>
-        </w:numPr>
-        <w:pStyle w:val="Compact"/>
+        <w:pStyle w:val="BodyText"/>
       </w:pPr>
       <w:r>
         <w:t xml:space="preserve">2010 —</w:t>
@@ -1607,11 +1707,7 @@
     </w:p>
     <w:p>
       <w:pPr>
-        <w:numPr>
-          <w:ilvl w:val="0"/>
-          <w:numId w:val="1007"/>
-        </w:numPr>
-        <w:pStyle w:val="Compact"/>
+        <w:pStyle w:val="BodyText"/>
       </w:pPr>
       <w:r>
         <w:t xml:space="preserve">2009 —</w:t>
@@ -1625,11 +1721,7 @@
     </w:p>
     <w:p>
       <w:pPr>
-        <w:numPr>
-          <w:ilvl w:val="0"/>
-          <w:numId w:val="1007"/>
-        </w:numPr>
-        <w:pStyle w:val="Compact"/>
+        <w:pStyle w:val="BodyText"/>
       </w:pPr>
       <w:r>
         <w:t xml:space="preserve">2008 —</w:t>
@@ -1643,11 +1735,7 @@
     </w:p>
     <w:p>
       <w:pPr>
-        <w:numPr>
-          <w:ilvl w:val="0"/>
-          <w:numId w:val="1007"/>
-        </w:numPr>
-        <w:pStyle w:val="Compact"/>
+        <w:pStyle w:val="BodyText"/>
       </w:pPr>
       <w:r>
         <w:t xml:space="preserve">2007 —</w:t>
@@ -1661,11 +1749,7 @@
     </w:p>
     <w:p>
       <w:pPr>
-        <w:numPr>
-          <w:ilvl w:val="0"/>
-          <w:numId w:val="1007"/>
-        </w:numPr>
-        <w:pStyle w:val="Compact"/>
+        <w:pStyle w:val="BodyText"/>
       </w:pPr>
       <w:r>
         <w:t xml:space="preserve">2004 —</w:t>
@@ -1679,11 +1763,7 @@
     </w:p>
     <w:p>
       <w:pPr>
-        <w:numPr>
-          <w:ilvl w:val="0"/>
-          <w:numId w:val="1007"/>
-        </w:numPr>
-        <w:pStyle w:val="Compact"/>
+        <w:pStyle w:val="BodyText"/>
       </w:pPr>
       <w:r>
         <w:t xml:space="preserve">2003 —</w:t>
@@ -1697,11 +1777,7 @@
     </w:p>
     <w:p>
       <w:pPr>
-        <w:numPr>
-          <w:ilvl w:val="0"/>
-          <w:numId w:val="1007"/>
-        </w:numPr>
-        <w:pStyle w:val="Compact"/>
+        <w:pStyle w:val="BodyText"/>
       </w:pPr>
       <w:r>
         <w:t xml:space="preserve">2002 —</w:t>
@@ -1738,11 +1814,7 @@
     </w:p>
     <w:p>
       <w:pPr>
-        <w:numPr>
-          <w:ilvl w:val="0"/>
-          <w:numId w:val="1007"/>
-        </w:numPr>
-        <w:pStyle w:val="Compact"/>
+        <w:pStyle w:val="BodyText"/>
       </w:pPr>
       <w:r>
         <w:t xml:space="preserve">2001 —</w:t>
@@ -1769,11 +1841,7 @@
     </w:p>
     <w:p>
       <w:pPr>
-        <w:numPr>
-          <w:ilvl w:val="0"/>
-          <w:numId w:val="1007"/>
-        </w:numPr>
-        <w:pStyle w:val="Compact"/>
+        <w:pStyle w:val="BodyText"/>
       </w:pPr>
       <w:r>
         <w:t xml:space="preserve">2000 —</w:t>
@@ -1787,11 +1855,7 @@
     </w:p>
     <w:p>
       <w:pPr>
-        <w:numPr>
-          <w:ilvl w:val="0"/>
-          <w:numId w:val="1007"/>
-        </w:numPr>
-        <w:pStyle w:val="Compact"/>
+        <w:pStyle w:val="BodyText"/>
       </w:pPr>
       <w:r>
         <w:t xml:space="preserve">1999 —</w:t>
@@ -1815,11 +1879,7 @@
     </w:p>
     <w:p>
       <w:pPr>
-        <w:numPr>
-          <w:ilvl w:val="0"/>
-          <w:numId w:val="1008"/>
-        </w:numPr>
-        <w:pStyle w:val="Compact"/>
+        <w:pStyle w:val="FirstParagraph"/>
       </w:pPr>
       <w:r>
         <w:t xml:space="preserve">AfterImage, 2008–2009</w:t>
@@ -1827,11 +1887,7 @@
     </w:p>
     <w:p>
       <w:pPr>
-        <w:numPr>
-          <w:ilvl w:val="0"/>
-          <w:numId w:val="1008"/>
-        </w:numPr>
-        <w:pStyle w:val="Compact"/>
+        <w:pStyle w:val="BodyText"/>
       </w:pPr>
       <w:r>
         <w:t xml:space="preserve">Architect's Newspaper, November 2005–2010</w:t>
@@ -1849,11 +1905,7 @@
     </w:p>
     <w:p>
       <w:pPr>
-        <w:numPr>
-          <w:ilvl w:val="0"/>
-          <w:numId w:val="1009"/>
-        </w:numPr>
-        <w:pStyle w:val="Compact"/>
+        <w:pStyle w:val="FirstParagraph"/>
       </w:pPr>
       <w:r>
         <w:t xml:space="preserve">2008–10 —</w:t>
@@ -1867,11 +1919,7 @@
     </w:p>
     <w:p>
       <w:pPr>
-        <w:numPr>
-          <w:ilvl w:val="0"/>
-          <w:numId w:val="1009"/>
-        </w:numPr>
-        <w:pStyle w:val="Compact"/>
+        <w:pStyle w:val="BodyText"/>
       </w:pPr>
       <w:r>
         <w:t xml:space="preserve">2009 —</w:t>
@@ -1885,11 +1933,7 @@
     </w:p>
     <w:p>
       <w:pPr>
-        <w:numPr>
-          <w:ilvl w:val="0"/>
-          <w:numId w:val="1009"/>
-        </w:numPr>
-        <w:pStyle w:val="Compact"/>
+        <w:pStyle w:val="BodyText"/>
       </w:pPr>
       <w:r>
         <w:t xml:space="preserve">2008 —</w:t>
@@ -1903,11 +1947,7 @@
     </w:p>
     <w:p>
       <w:pPr>
-        <w:numPr>
-          <w:ilvl w:val="0"/>
-          <w:numId w:val="1009"/>
-        </w:numPr>
-        <w:pStyle w:val="Compact"/>
+        <w:pStyle w:val="BodyText"/>
       </w:pPr>
       <w:r>
         <w:t xml:space="preserve">2008 —</w:t>
@@ -1921,11 +1961,7 @@
     </w:p>
     <w:p>
       <w:pPr>
-        <w:numPr>
-          <w:ilvl w:val="0"/>
-          <w:numId w:val="1009"/>
-        </w:numPr>
-        <w:pStyle w:val="Compact"/>
+        <w:pStyle w:val="BodyText"/>
       </w:pPr>
       <w:r>
         <w:t xml:space="preserve">2007 —</w:t>
@@ -1950,11 +1986,7 @@
     </w:p>
     <w:p>
       <w:pPr>
-        <w:numPr>
-          <w:ilvl w:val="0"/>
-          <w:numId w:val="1010"/>
-        </w:numPr>
-        <w:pStyle w:val="Compact"/>
+        <w:pStyle w:val="FirstParagraph"/>
       </w:pPr>
       <w:r>
         <w:t xml:space="preserve">2022 —</w:t>
@@ -1973,11 +2005,7 @@
     </w:p>
     <w:p>
       <w:pPr>
-        <w:numPr>
-          <w:ilvl w:val="0"/>
-          <w:numId w:val="1010"/>
-        </w:numPr>
-        <w:pStyle w:val="Compact"/>
+        <w:pStyle w:val="BodyText"/>
       </w:pPr>
       <w:r>
         <w:t xml:space="preserve">2017 —</w:t>
@@ -1991,11 +2019,7 @@
     </w:p>
     <w:p>
       <w:pPr>
-        <w:numPr>
-          <w:ilvl w:val="0"/>
-          <w:numId w:val="1010"/>
-        </w:numPr>
-        <w:pStyle w:val="Compact"/>
+        <w:pStyle w:val="BodyText"/>
       </w:pPr>
       <w:r>
         <w:t xml:space="preserve">2017 —</w:t>
@@ -2009,11 +2033,7 @@
     </w:p>
     <w:p>
       <w:pPr>
-        <w:numPr>
-          <w:ilvl w:val="0"/>
-          <w:numId w:val="1010"/>
-        </w:numPr>
-        <w:pStyle w:val="Compact"/>
+        <w:pStyle w:val="BodyText"/>
       </w:pPr>
       <w:r>
         <w:t xml:space="preserve">2015 —</w:t>
@@ -2027,11 +2047,7 @@
     </w:p>
     <w:p>
       <w:pPr>
-        <w:numPr>
-          <w:ilvl w:val="0"/>
-          <w:numId w:val="1010"/>
-        </w:numPr>
-        <w:pStyle w:val="Compact"/>
+        <w:pStyle w:val="BodyText"/>
       </w:pPr>
       <w:r>
         <w:t xml:space="preserve">2014 —</w:t>
@@ -2045,11 +2061,7 @@
     </w:p>
     <w:p>
       <w:pPr>
-        <w:numPr>
-          <w:ilvl w:val="0"/>
-          <w:numId w:val="1010"/>
-        </w:numPr>
-        <w:pStyle w:val="Compact"/>
+        <w:pStyle w:val="BodyText"/>
       </w:pPr>
       <w:r>
         <w:t xml:space="preserve">2014 —</w:t>
@@ -2063,11 +2075,7 @@
     </w:p>
     <w:p>
       <w:pPr>
-        <w:numPr>
-          <w:ilvl w:val="0"/>
-          <w:numId w:val="1010"/>
-        </w:numPr>
-        <w:pStyle w:val="Compact"/>
+        <w:pStyle w:val="BodyText"/>
       </w:pPr>
       <w:r>
         <w:t xml:space="preserve">2013 —</w:t>
@@ -2081,11 +2089,7 @@
     </w:p>
     <w:p>
       <w:pPr>
-        <w:numPr>
-          <w:ilvl w:val="0"/>
-          <w:numId w:val="1010"/>
-        </w:numPr>
-        <w:pStyle w:val="Compact"/>
+        <w:pStyle w:val="BodyText"/>
       </w:pPr>
       <w:r>
         <w:t xml:space="preserve">2013 —</w:t>
@@ -2099,11 +2103,7 @@
     </w:p>
     <w:p>
       <w:pPr>
-        <w:numPr>
-          <w:ilvl w:val="0"/>
-          <w:numId w:val="1010"/>
-        </w:numPr>
-        <w:pStyle w:val="Compact"/>
+        <w:pStyle w:val="BodyText"/>
       </w:pPr>
       <w:r>
         <w:t xml:space="preserve">2011 —</w:t>
@@ -2117,11 +2117,7 @@
     </w:p>
     <w:p>
       <w:pPr>
-        <w:numPr>
-          <w:ilvl w:val="0"/>
-          <w:numId w:val="1010"/>
-        </w:numPr>
-        <w:pStyle w:val="Compact"/>
+        <w:pStyle w:val="BodyText"/>
       </w:pPr>
       <w:r>
         <w:t xml:space="preserve">2011 —</w:t>
@@ -2135,11 +2131,7 @@
     </w:p>
     <w:p>
       <w:pPr>
-        <w:numPr>
-          <w:ilvl w:val="0"/>
-          <w:numId w:val="1010"/>
-        </w:numPr>
-        <w:pStyle w:val="Compact"/>
+        <w:pStyle w:val="BodyText"/>
       </w:pPr>
       <w:r>
         <w:t xml:space="preserve">2010 —</w:t>
@@ -2153,11 +2145,7 @@
     </w:p>
     <w:p>
       <w:pPr>
-        <w:numPr>
-          <w:ilvl w:val="0"/>
-          <w:numId w:val="1010"/>
-        </w:numPr>
-        <w:pStyle w:val="Compact"/>
+        <w:pStyle w:val="BodyText"/>
       </w:pPr>
       <w:r>
         <w:t xml:space="preserve">2010 —</w:t>
@@ -2171,11 +2159,7 @@
     </w:p>
     <w:p>
       <w:pPr>
-        <w:numPr>
-          <w:ilvl w:val="0"/>
-          <w:numId w:val="1010"/>
-        </w:numPr>
-        <w:pStyle w:val="Compact"/>
+        <w:pStyle w:val="BodyText"/>
       </w:pPr>
       <w:r>
         <w:t xml:space="preserve">2009 —</w:t>
@@ -2189,11 +2173,7 @@
     </w:p>
     <w:p>
       <w:pPr>
-        <w:numPr>
-          <w:ilvl w:val="0"/>
-          <w:numId w:val="1010"/>
-        </w:numPr>
-        <w:pStyle w:val="Compact"/>
+        <w:pStyle w:val="BodyText"/>
       </w:pPr>
       <w:r>
         <w:t xml:space="preserve">2009 —</w:t>
@@ -2207,11 +2187,7 @@
     </w:p>
     <w:p>
       <w:pPr>
-        <w:numPr>
-          <w:ilvl w:val="0"/>
-          <w:numId w:val="1010"/>
-        </w:numPr>
-        <w:pStyle w:val="Compact"/>
+        <w:pStyle w:val="BodyText"/>
       </w:pPr>
       <w:r>
         <w:t xml:space="preserve">2008 —</w:t>
@@ -2225,11 +2201,7 @@
     </w:p>
     <w:p>
       <w:pPr>
-        <w:numPr>
-          <w:ilvl w:val="0"/>
-          <w:numId w:val="1010"/>
-        </w:numPr>
-        <w:pStyle w:val="Compact"/>
+        <w:pStyle w:val="BodyText"/>
       </w:pPr>
       <w:r>
         <w:t xml:space="preserve">2008 —</w:t>
@@ -2243,11 +2215,7 @@
     </w:p>
     <w:p>
       <w:pPr>
-        <w:numPr>
-          <w:ilvl w:val="0"/>
-          <w:numId w:val="1010"/>
-        </w:numPr>
-        <w:pStyle w:val="Compact"/>
+        <w:pStyle w:val="BodyText"/>
       </w:pPr>
       <w:r>
         <w:t xml:space="preserve">2007 —</w:t>
@@ -2261,11 +2229,7 @@
     </w:p>
     <w:p>
       <w:pPr>
-        <w:numPr>
-          <w:ilvl w:val="0"/>
-          <w:numId w:val="1010"/>
-        </w:numPr>
-        <w:pStyle w:val="Compact"/>
+        <w:pStyle w:val="BodyText"/>
       </w:pPr>
       <w:r>
         <w:t xml:space="preserve">2007 —</w:t>
@@ -2279,11 +2243,7 @@
     </w:p>
     <w:p>
       <w:pPr>
-        <w:numPr>
-          <w:ilvl w:val="0"/>
-          <w:numId w:val="1010"/>
-        </w:numPr>
-        <w:pStyle w:val="Compact"/>
+        <w:pStyle w:val="BodyText"/>
       </w:pPr>
       <w:r>
         <w:t xml:space="preserve">2007 —</w:t>
@@ -2297,11 +2257,7 @@
     </w:p>
     <w:p>
       <w:pPr>
-        <w:numPr>
-          <w:ilvl w:val="0"/>
-          <w:numId w:val="1010"/>
-        </w:numPr>
-        <w:pStyle w:val="Compact"/>
+        <w:pStyle w:val="BodyText"/>
       </w:pPr>
       <w:r>
         <w:t xml:space="preserve">2006 —</w:t>
@@ -2315,11 +2271,7 @@
     </w:p>
     <w:p>
       <w:pPr>
-        <w:numPr>
-          <w:ilvl w:val="0"/>
-          <w:numId w:val="1010"/>
-        </w:numPr>
-        <w:pStyle w:val="Compact"/>
+        <w:pStyle w:val="BodyText"/>
       </w:pPr>
       <w:r>
         <w:t xml:space="preserve">2006 —</w:t>
@@ -2333,11 +2285,7 @@
     </w:p>
     <w:p>
       <w:pPr>
-        <w:numPr>
-          <w:ilvl w:val="0"/>
-          <w:numId w:val="1010"/>
-        </w:numPr>
-        <w:pStyle w:val="Compact"/>
+        <w:pStyle w:val="BodyText"/>
       </w:pPr>
       <w:r>
         <w:t xml:space="preserve">2005 —</w:t>
@@ -2351,11 +2299,7 @@
     </w:p>
     <w:p>
       <w:pPr>
-        <w:numPr>
-          <w:ilvl w:val="0"/>
-          <w:numId w:val="1010"/>
-        </w:numPr>
-        <w:pStyle w:val="Compact"/>
+        <w:pStyle w:val="BodyText"/>
       </w:pPr>
       <w:r>
         <w:t xml:space="preserve">2005 —</w:t>
@@ -2369,11 +2313,7 @@
     </w:p>
     <w:p>
       <w:pPr>
-        <w:numPr>
-          <w:ilvl w:val="0"/>
-          <w:numId w:val="1010"/>
-        </w:numPr>
-        <w:pStyle w:val="Compact"/>
+        <w:pStyle w:val="BodyText"/>
       </w:pPr>
       <w:r>
         <w:t xml:space="preserve">2005 —</w:t>
@@ -2387,11 +2327,7 @@
     </w:p>
     <w:p>
       <w:pPr>
-        <w:numPr>
-          <w:ilvl w:val="0"/>
-          <w:numId w:val="1010"/>
-        </w:numPr>
-        <w:pStyle w:val="Compact"/>
+        <w:pStyle w:val="BodyText"/>
       </w:pPr>
       <w:r>
         <w:t xml:space="preserve">2005 —</w:t>
@@ -2405,11 +2341,7 @@
     </w:p>
     <w:p>
       <w:pPr>
-        <w:numPr>
-          <w:ilvl w:val="0"/>
-          <w:numId w:val="1010"/>
-        </w:numPr>
-        <w:pStyle w:val="Compact"/>
+        <w:pStyle w:val="BodyText"/>
       </w:pPr>
       <w:r>
         <w:t xml:space="preserve">2005 —</w:t>
@@ -2423,11 +2355,7 @@
     </w:p>
     <w:p>
       <w:pPr>
-        <w:numPr>
-          <w:ilvl w:val="0"/>
-          <w:numId w:val="1010"/>
-        </w:numPr>
-        <w:pStyle w:val="Compact"/>
+        <w:pStyle w:val="BodyText"/>
       </w:pPr>
       <w:r>
         <w:t xml:space="preserve">2005 —</w:t>
@@ -2441,11 +2369,7 @@
     </w:p>
     <w:p>
       <w:pPr>
-        <w:numPr>
-          <w:ilvl w:val="0"/>
-          <w:numId w:val="1010"/>
-        </w:numPr>
-        <w:pStyle w:val="Compact"/>
+        <w:pStyle w:val="BodyText"/>
       </w:pPr>
       <w:r>
         <w:t xml:space="preserve">2005 —</w:t>
@@ -2459,11 +2383,7 @@
     </w:p>
     <w:p>
       <w:pPr>
-        <w:numPr>
-          <w:ilvl w:val="0"/>
-          <w:numId w:val="1010"/>
-        </w:numPr>
-        <w:pStyle w:val="Compact"/>
+        <w:pStyle w:val="BodyText"/>
       </w:pPr>
       <w:r>
         <w:t xml:space="preserve">2005 —</w:t>
@@ -2477,11 +2397,7 @@
     </w:p>
     <w:p>
       <w:pPr>
-        <w:numPr>
-          <w:ilvl w:val="0"/>
-          <w:numId w:val="1010"/>
-        </w:numPr>
-        <w:pStyle w:val="Compact"/>
+        <w:pStyle w:val="BodyText"/>
       </w:pPr>
       <w:r>
         <w:t xml:space="preserve">2004 —</w:t>
@@ -2495,11 +2411,7 @@
     </w:p>
     <w:p>
       <w:pPr>
-        <w:numPr>
-          <w:ilvl w:val="0"/>
-          <w:numId w:val="1010"/>
-        </w:numPr>
-        <w:pStyle w:val="Compact"/>
+        <w:pStyle w:val="BodyText"/>
       </w:pPr>
       <w:r>
         <w:t xml:space="preserve">2004 —</w:t>
@@ -2513,11 +2425,7 @@
     </w:p>
     <w:p>
       <w:pPr>
-        <w:numPr>
-          <w:ilvl w:val="0"/>
-          <w:numId w:val="1010"/>
-        </w:numPr>
-        <w:pStyle w:val="Compact"/>
+        <w:pStyle w:val="BodyText"/>
       </w:pPr>
       <w:r>
         <w:t xml:space="preserve">2004 —</w:t>
@@ -2531,11 +2439,7 @@
     </w:p>
     <w:p>
       <w:pPr>
-        <w:numPr>
-          <w:ilvl w:val="0"/>
-          <w:numId w:val="1010"/>
-        </w:numPr>
-        <w:pStyle w:val="Compact"/>
+        <w:pStyle w:val="BodyText"/>
       </w:pPr>
       <w:r>
         <w:t xml:space="preserve">2004 —</w:t>
@@ -2549,11 +2453,7 @@
     </w:p>
     <w:p>
       <w:pPr>
-        <w:numPr>
-          <w:ilvl w:val="0"/>
-          <w:numId w:val="1010"/>
-        </w:numPr>
-        <w:pStyle w:val="Compact"/>
+        <w:pStyle w:val="BodyText"/>
       </w:pPr>
       <w:r>
         <w:t xml:space="preserve">2004 —</w:t>
@@ -2567,11 +2467,7 @@
     </w:p>
     <w:p>
       <w:pPr>
-        <w:numPr>
-          <w:ilvl w:val="0"/>
-          <w:numId w:val="1010"/>
-        </w:numPr>
-        <w:pStyle w:val="Compact"/>
+        <w:pStyle w:val="BodyText"/>
       </w:pPr>
       <w:r>
         <w:t xml:space="preserve">2004 —</w:t>
@@ -2585,11 +2481,7 @@
     </w:p>
     <w:p>
       <w:pPr>
-        <w:numPr>
-          <w:ilvl w:val="0"/>
-          <w:numId w:val="1010"/>
-        </w:numPr>
-        <w:pStyle w:val="Compact"/>
+        <w:pStyle w:val="BodyText"/>
       </w:pPr>
       <w:r>
         <w:t xml:space="preserve">2004 —</w:t>
@@ -2603,11 +2495,7 @@
     </w:p>
     <w:p>
       <w:pPr>
-        <w:numPr>
-          <w:ilvl w:val="0"/>
-          <w:numId w:val="1010"/>
-        </w:numPr>
-        <w:pStyle w:val="Compact"/>
+        <w:pStyle w:val="BodyText"/>
       </w:pPr>
       <w:r>
         <w:t xml:space="preserve">2003 —</w:t>
@@ -2621,11 +2509,7 @@
     </w:p>
     <w:p>
       <w:pPr>
-        <w:numPr>
-          <w:ilvl w:val="0"/>
-          <w:numId w:val="1010"/>
-        </w:numPr>
-        <w:pStyle w:val="Compact"/>
+        <w:pStyle w:val="BodyText"/>
       </w:pPr>
       <w:r>
         <w:t xml:space="preserve">2003 —</w:t>
@@ -2639,11 +2523,7 @@
     </w:p>
     <w:p>
       <w:pPr>
-        <w:numPr>
-          <w:ilvl w:val="0"/>
-          <w:numId w:val="1010"/>
-        </w:numPr>
-        <w:pStyle w:val="Compact"/>
+        <w:pStyle w:val="BodyText"/>
       </w:pPr>
       <w:r>
         <w:t xml:space="preserve">2003 —</w:t>
@@ -2657,11 +2537,7 @@
     </w:p>
     <w:p>
       <w:pPr>
-        <w:numPr>
-          <w:ilvl w:val="0"/>
-          <w:numId w:val="1010"/>
-        </w:numPr>
-        <w:pStyle w:val="Compact"/>
+        <w:pStyle w:val="BodyText"/>
       </w:pPr>
       <w:r>
         <w:t xml:space="preserve">2003 —</w:t>
@@ -2675,11 +2551,7 @@
     </w:p>
     <w:p>
       <w:pPr>
-        <w:numPr>
-          <w:ilvl w:val="0"/>
-          <w:numId w:val="1010"/>
-        </w:numPr>
-        <w:pStyle w:val="Compact"/>
+        <w:pStyle w:val="BodyText"/>
       </w:pPr>
       <w:r>
         <w:t xml:space="preserve">2003 —</w:t>
@@ -2693,11 +2565,7 @@
     </w:p>
     <w:p>
       <w:pPr>
-        <w:numPr>
-          <w:ilvl w:val="0"/>
-          <w:numId w:val="1010"/>
-        </w:numPr>
-        <w:pStyle w:val="Compact"/>
+        <w:pStyle w:val="BodyText"/>
       </w:pPr>
       <w:r>
         <w:t xml:space="preserve">2003 —</w:t>
@@ -2711,11 +2579,7 @@
     </w:p>
     <w:p>
       <w:pPr>
-        <w:numPr>
-          <w:ilvl w:val="0"/>
-          <w:numId w:val="1010"/>
-        </w:numPr>
-        <w:pStyle w:val="Compact"/>
+        <w:pStyle w:val="BodyText"/>
       </w:pPr>
       <w:r>
         <w:t xml:space="preserve">2003 —</w:t>
@@ -2729,11 +2593,7 @@
     </w:p>
     <w:p>
       <w:pPr>
-        <w:numPr>
-          <w:ilvl w:val="0"/>
-          <w:numId w:val="1010"/>
-        </w:numPr>
-        <w:pStyle w:val="Compact"/>
+        <w:pStyle w:val="BodyText"/>
       </w:pPr>
       <w:r>
         <w:t xml:space="preserve">2003 —</w:t>
@@ -2747,11 +2607,7 @@
     </w:p>
     <w:p>
       <w:pPr>
-        <w:numPr>
-          <w:ilvl w:val="0"/>
-          <w:numId w:val="1010"/>
-        </w:numPr>
-        <w:pStyle w:val="Compact"/>
+        <w:pStyle w:val="BodyText"/>
       </w:pPr>
       <w:r>
         <w:t xml:space="preserve">2003 —</w:t>
@@ -2765,11 +2621,7 @@
     </w:p>
     <w:p>
       <w:pPr>
-        <w:numPr>
-          <w:ilvl w:val="0"/>
-          <w:numId w:val="1010"/>
-        </w:numPr>
-        <w:pStyle w:val="Compact"/>
+        <w:pStyle w:val="BodyText"/>
       </w:pPr>
       <w:r>
         <w:t xml:space="preserve">2003 —</w:t>
@@ -2783,11 +2635,7 @@
     </w:p>
     <w:p>
       <w:pPr>
-        <w:numPr>
-          <w:ilvl w:val="0"/>
-          <w:numId w:val="1010"/>
-        </w:numPr>
-        <w:pStyle w:val="Compact"/>
+        <w:pStyle w:val="BodyText"/>
       </w:pPr>
       <w:r>
         <w:t xml:space="preserve">2003 —</w:t>
@@ -2801,11 +2649,7 @@
     </w:p>
     <w:p>
       <w:pPr>
-        <w:numPr>
-          <w:ilvl w:val="0"/>
-          <w:numId w:val="1010"/>
-        </w:numPr>
-        <w:pStyle w:val="Compact"/>
+        <w:pStyle w:val="BodyText"/>
       </w:pPr>
       <w:r>
         <w:t xml:space="preserve">2003 —</w:t>
@@ -2819,11 +2663,7 @@
     </w:p>
     <w:p>
       <w:pPr>
-        <w:numPr>
-          <w:ilvl w:val="0"/>
-          <w:numId w:val="1010"/>
-        </w:numPr>
-        <w:pStyle w:val="Compact"/>
+        <w:pStyle w:val="BodyText"/>
       </w:pPr>
       <w:r>
         <w:t xml:space="preserve">2003 —</w:t>
@@ -2837,11 +2677,7 @@
     </w:p>
     <w:p>
       <w:pPr>
-        <w:numPr>
-          <w:ilvl w:val="0"/>
-          <w:numId w:val="1010"/>
-        </w:numPr>
-        <w:pStyle w:val="Compact"/>
+        <w:pStyle w:val="BodyText"/>
       </w:pPr>
       <w:r>
         <w:t xml:space="preserve">2003 —</w:t>
@@ -2855,11 +2691,7 @@
     </w:p>
     <w:p>
       <w:pPr>
-        <w:numPr>
-          <w:ilvl w:val="0"/>
-          <w:numId w:val="1010"/>
-        </w:numPr>
-        <w:pStyle w:val="Compact"/>
+        <w:pStyle w:val="BodyText"/>
       </w:pPr>
       <w:r>
         <w:t xml:space="preserve">2003 —</w:t>
@@ -2873,11 +2705,7 @@
     </w:p>
     <w:p>
       <w:pPr>
-        <w:numPr>
-          <w:ilvl w:val="0"/>
-          <w:numId w:val="1010"/>
-        </w:numPr>
-        <w:pStyle w:val="Compact"/>
+        <w:pStyle w:val="BodyText"/>
       </w:pPr>
       <w:r>
         <w:t xml:space="preserve">2003 —</w:t>
@@ -2891,11 +2719,7 @@
     </w:p>
     <w:p>
       <w:pPr>
-        <w:numPr>
-          <w:ilvl w:val="0"/>
-          <w:numId w:val="1010"/>
-        </w:numPr>
-        <w:pStyle w:val="Compact"/>
+        <w:pStyle w:val="BodyText"/>
       </w:pPr>
       <w:r>
         <w:t xml:space="preserve">2002 —</w:t>
@@ -2909,11 +2733,7 @@
     </w:p>
     <w:p>
       <w:pPr>
-        <w:numPr>
-          <w:ilvl w:val="0"/>
-          <w:numId w:val="1010"/>
-        </w:numPr>
-        <w:pStyle w:val="Compact"/>
+        <w:pStyle w:val="BodyText"/>
       </w:pPr>
       <w:r>
         <w:t xml:space="preserve">2002 —</w:t>
@@ -2927,11 +2747,7 @@
     </w:p>
     <w:p>
       <w:pPr>
-        <w:numPr>
-          <w:ilvl w:val="0"/>
-          <w:numId w:val="1010"/>
-        </w:numPr>
-        <w:pStyle w:val="Compact"/>
+        <w:pStyle w:val="BodyText"/>
       </w:pPr>
       <w:r>
         <w:t xml:space="preserve">2002 —</w:t>
@@ -2945,11 +2761,7 @@
     </w:p>
     <w:p>
       <w:pPr>
-        <w:numPr>
-          <w:ilvl w:val="0"/>
-          <w:numId w:val="1010"/>
-        </w:numPr>
-        <w:pStyle w:val="Compact"/>
+        <w:pStyle w:val="BodyText"/>
       </w:pPr>
       <w:r>
         <w:t xml:space="preserve">2002 —</w:t>
@@ -2963,11 +2775,7 @@
     </w:p>
     <w:p>
       <w:pPr>
-        <w:numPr>
-          <w:ilvl w:val="0"/>
-          <w:numId w:val="1010"/>
-        </w:numPr>
-        <w:pStyle w:val="Compact"/>
+        <w:pStyle w:val="BodyText"/>
       </w:pPr>
       <w:r>
         <w:t xml:space="preserve">2001 —</w:t>
@@ -2981,11 +2789,7 @@
     </w:p>
     <w:p>
       <w:pPr>
-        <w:numPr>
-          <w:ilvl w:val="0"/>
-          <w:numId w:val="1010"/>
-        </w:numPr>
-        <w:pStyle w:val="Compact"/>
+        <w:pStyle w:val="BodyText"/>
       </w:pPr>
       <w:r>
         <w:t xml:space="preserve">2001 —</w:t>
@@ -2999,11 +2803,7 @@
     </w:p>
     <w:p>
       <w:pPr>
-        <w:numPr>
-          <w:ilvl w:val="0"/>
-          <w:numId w:val="1010"/>
-        </w:numPr>
-        <w:pStyle w:val="Compact"/>
+        <w:pStyle w:val="BodyText"/>
       </w:pPr>
       <w:r>
         <w:t xml:space="preserve">2001 —</w:t>
@@ -3017,11 +2817,7 @@
     </w:p>
     <w:p>
       <w:pPr>
-        <w:numPr>
-          <w:ilvl w:val="0"/>
-          <w:numId w:val="1010"/>
-        </w:numPr>
-        <w:pStyle w:val="Compact"/>
+        <w:pStyle w:val="BodyText"/>
       </w:pPr>
       <w:r>
         <w:t xml:space="preserve">2001 —</w:t>
@@ -3035,11 +2831,7 @@
     </w:p>
     <w:p>
       <w:pPr>
-        <w:numPr>
-          <w:ilvl w:val="0"/>
-          <w:numId w:val="1010"/>
-        </w:numPr>
-        <w:pStyle w:val="Compact"/>
+        <w:pStyle w:val="BodyText"/>
       </w:pPr>
       <w:r>
         <w:t xml:space="preserve">2001 —</w:t>
@@ -3053,11 +2845,7 @@
     </w:p>
     <w:p>
       <w:pPr>
-        <w:numPr>
-          <w:ilvl w:val="0"/>
-          <w:numId w:val="1010"/>
-        </w:numPr>
-        <w:pStyle w:val="Compact"/>
+        <w:pStyle w:val="BodyText"/>
       </w:pPr>
       <w:r>
         <w:t xml:space="preserve">2001 —</w:t>
@@ -3071,11 +2859,7 @@
     </w:p>
     <w:p>
       <w:pPr>
-        <w:numPr>
-          <w:ilvl w:val="0"/>
-          <w:numId w:val="1010"/>
-        </w:numPr>
-        <w:pStyle w:val="Compact"/>
+        <w:pStyle w:val="BodyText"/>
       </w:pPr>
       <w:r>
         <w:t xml:space="preserve">2001 —</w:t>
@@ -3089,11 +2873,7 @@
     </w:p>
     <w:p>
       <w:pPr>
-        <w:numPr>
-          <w:ilvl w:val="0"/>
-          <w:numId w:val="1010"/>
-        </w:numPr>
-        <w:pStyle w:val="Compact"/>
+        <w:pStyle w:val="BodyText"/>
       </w:pPr>
       <w:r>
         <w:t xml:space="preserve">2001 —</w:t>
@@ -3107,11 +2887,7 @@
     </w:p>
     <w:p>
       <w:pPr>
-        <w:numPr>
-          <w:ilvl w:val="0"/>
-          <w:numId w:val="1010"/>
-        </w:numPr>
-        <w:pStyle w:val="Compact"/>
+        <w:pStyle w:val="BodyText"/>
       </w:pPr>
       <w:r>
         <w:t xml:space="preserve">2000 —</w:t>
@@ -3125,11 +2901,7 @@
     </w:p>
     <w:p>
       <w:pPr>
-        <w:numPr>
-          <w:ilvl w:val="0"/>
-          <w:numId w:val="1010"/>
-        </w:numPr>
-        <w:pStyle w:val="Compact"/>
+        <w:pStyle w:val="BodyText"/>
       </w:pPr>
       <w:r>
         <w:t xml:space="preserve">2000 —</w:t>
@@ -3143,11 +2915,7 @@
     </w:p>
     <w:p>
       <w:pPr>
-        <w:numPr>
-          <w:ilvl w:val="0"/>
-          <w:numId w:val="1010"/>
-        </w:numPr>
-        <w:pStyle w:val="Compact"/>
+        <w:pStyle w:val="BodyText"/>
       </w:pPr>
       <w:r>
         <w:t xml:space="preserve">1999 —</w:t>
@@ -3161,11 +2929,7 @@
     </w:p>
     <w:p>
       <w:pPr>
-        <w:numPr>
-          <w:ilvl w:val="0"/>
-          <w:numId w:val="1010"/>
-        </w:numPr>
-        <w:pStyle w:val="Compact"/>
+        <w:pStyle w:val="BodyText"/>
       </w:pPr>
       <w:r>
         <w:t xml:space="preserve">1999 —</w:t>
@@ -3179,11 +2943,7 @@
     </w:p>
     <w:p>
       <w:pPr>
-        <w:numPr>
-          <w:ilvl w:val="0"/>
-          <w:numId w:val="1010"/>
-        </w:numPr>
-        <w:pStyle w:val="Compact"/>
+        <w:pStyle w:val="BodyText"/>
       </w:pPr>
       <w:r>
         <w:t xml:space="preserve">1997 —</w:t>
@@ -3197,11 +2957,7 @@
     </w:p>
     <w:p>
       <w:pPr>
-        <w:numPr>
-          <w:ilvl w:val="0"/>
-          <w:numId w:val="1010"/>
-        </w:numPr>
-        <w:pStyle w:val="Compact"/>
+        <w:pStyle w:val="BodyText"/>
       </w:pPr>
       <w:r>
         <w:t xml:space="preserve">1997 —</w:t>
@@ -3215,11 +2971,7 @@
     </w:p>
     <w:p>
       <w:pPr>
-        <w:numPr>
-          <w:ilvl w:val="0"/>
-          <w:numId w:val="1010"/>
-        </w:numPr>
-        <w:pStyle w:val="Compact"/>
+        <w:pStyle w:val="BodyText"/>
       </w:pPr>
       <w:r>
         <w:t xml:space="preserve">1997 —</w:t>
@@ -3233,11 +2985,7 @@
     </w:p>
     <w:p>
       <w:pPr>
-        <w:numPr>
-          <w:ilvl w:val="0"/>
-          <w:numId w:val="1010"/>
-        </w:numPr>
-        <w:pStyle w:val="Compact"/>
+        <w:pStyle w:val="BodyText"/>
       </w:pPr>
       <w:r>
         <w:t xml:space="preserve">1996–2003 —</w:t>
@@ -3251,11 +2999,7 @@
     </w:p>
     <w:p>
       <w:pPr>
-        <w:numPr>
-          <w:ilvl w:val="0"/>
-          <w:numId w:val="1010"/>
-        </w:numPr>
-        <w:pStyle w:val="Compact"/>
+        <w:pStyle w:val="BodyText"/>
       </w:pPr>
       <w:r>
         <w:t xml:space="preserve">1997–2003 —</w:t>
@@ -3269,11 +3013,7 @@
     </w:p>
     <w:p>
       <w:pPr>
-        <w:numPr>
-          <w:ilvl w:val="0"/>
-          <w:numId w:val="1010"/>
-        </w:numPr>
-        <w:pStyle w:val="Compact"/>
+        <w:pStyle w:val="BodyText"/>
       </w:pPr>
       <w:r>
         <w:t xml:space="preserve">1998–2004 —</w:t>
@@ -3297,11 +3037,7 @@
     </w:p>
     <w:p>
       <w:pPr>
-        <w:numPr>
-          <w:ilvl w:val="0"/>
-          <w:numId w:val="1011"/>
-        </w:numPr>
-        <w:pStyle w:val="Compact"/>
+        <w:pStyle w:val="FirstParagraph"/>
       </w:pPr>
       <w:r>
         <w:t xml:space="preserve">2022 —</w:t>
@@ -3315,11 +3051,7 @@
     </w:p>
     <w:p>
       <w:pPr>
-        <w:numPr>
-          <w:ilvl w:val="0"/>
-          <w:numId w:val="1011"/>
-        </w:numPr>
-        <w:pStyle w:val="Compact"/>
+        <w:pStyle w:val="BodyText"/>
       </w:pPr>
       <w:r>
         <w:t xml:space="preserve">2017 —</w:t>
@@ -3333,11 +3065,7 @@
     </w:p>
     <w:p>
       <w:pPr>
-        <w:numPr>
-          <w:ilvl w:val="0"/>
-          <w:numId w:val="1011"/>
-        </w:numPr>
-        <w:pStyle w:val="Compact"/>
+        <w:pStyle w:val="BodyText"/>
       </w:pPr>
       <w:r>
         <w:t xml:space="preserve">2013 —</w:t>
@@ -3351,11 +3079,7 @@
     </w:p>
     <w:p>
       <w:pPr>
-        <w:numPr>
-          <w:ilvl w:val="0"/>
-          <w:numId w:val="1011"/>
-        </w:numPr>
-        <w:pStyle w:val="Compact"/>
+        <w:pStyle w:val="BodyText"/>
       </w:pPr>
       <w:r>
         <w:t xml:space="preserve">2012 —</w:t>
@@ -3369,11 +3093,7 @@
     </w:p>
     <w:p>
       <w:pPr>
-        <w:numPr>
-          <w:ilvl w:val="0"/>
-          <w:numId w:val="1011"/>
-        </w:numPr>
-        <w:pStyle w:val="Compact"/>
+        <w:pStyle w:val="BodyText"/>
       </w:pPr>
       <w:r>
         <w:t xml:space="preserve">2008 —</w:t>
@@ -3387,11 +3107,7 @@
     </w:p>
     <w:p>
       <w:pPr>
-        <w:numPr>
-          <w:ilvl w:val="0"/>
-          <w:numId w:val="1011"/>
-        </w:numPr>
-        <w:pStyle w:val="Compact"/>
+        <w:pStyle w:val="BodyText"/>
       </w:pPr>
       <w:r>
         <w:t xml:space="preserve">2008 —</w:t>
@@ -3405,11 +3121,7 @@
     </w:p>
     <w:p>
       <w:pPr>
-        <w:numPr>
-          <w:ilvl w:val="0"/>
-          <w:numId w:val="1011"/>
-        </w:numPr>
-        <w:pStyle w:val="Compact"/>
+        <w:pStyle w:val="BodyText"/>
       </w:pPr>
       <w:r>
         <w:t xml:space="preserve">2005 —</w:t>
@@ -3423,11 +3135,7 @@
     </w:p>
     <w:p>
       <w:pPr>
-        <w:numPr>
-          <w:ilvl w:val="0"/>
-          <w:numId w:val="1011"/>
-        </w:numPr>
-        <w:pStyle w:val="Compact"/>
+        <w:pStyle w:val="BodyText"/>
       </w:pPr>
       <w:r>
         <w:t xml:space="preserve">2004 —</w:t>
@@ -3441,11 +3149,7 @@
     </w:p>
     <w:p>
       <w:pPr>
-        <w:numPr>
-          <w:ilvl w:val="0"/>
-          <w:numId w:val="1011"/>
-        </w:numPr>
-        <w:pStyle w:val="Compact"/>
+        <w:pStyle w:val="BodyText"/>
       </w:pPr>
       <w:r>
         <w:t xml:space="preserve">2004 —</w:t>
@@ -3459,11 +3163,7 @@
     </w:p>
     <w:p>
       <w:pPr>
-        <w:numPr>
-          <w:ilvl w:val="0"/>
-          <w:numId w:val="1011"/>
-        </w:numPr>
-        <w:pStyle w:val="Compact"/>
+        <w:pStyle w:val="BodyText"/>
       </w:pPr>
       <w:r>
         <w:t xml:space="preserve">2004 —</w:t>
@@ -3477,11 +3177,7 @@
     </w:p>
     <w:p>
       <w:pPr>
-        <w:numPr>
-          <w:ilvl w:val="0"/>
-          <w:numId w:val="1011"/>
-        </w:numPr>
-        <w:pStyle w:val="Compact"/>
+        <w:pStyle w:val="BodyText"/>
       </w:pPr>
       <w:r>
         <w:t xml:space="preserve">2004 —</w:t>
@@ -3495,11 +3191,7 @@
     </w:p>
     <w:p>
       <w:pPr>
-        <w:numPr>
-          <w:ilvl w:val="0"/>
-          <w:numId w:val="1011"/>
-        </w:numPr>
-        <w:pStyle w:val="Compact"/>
+        <w:pStyle w:val="BodyText"/>
       </w:pPr>
       <w:r>
         <w:t xml:space="preserve">2004 —</w:t>
@@ -3513,11 +3205,7 @@
     </w:p>
     <w:p>
       <w:pPr>
-        <w:numPr>
-          <w:ilvl w:val="0"/>
-          <w:numId w:val="1011"/>
-        </w:numPr>
-        <w:pStyle w:val="Compact"/>
+        <w:pStyle w:val="BodyText"/>
       </w:pPr>
       <w:r>
         <w:t xml:space="preserve">2003 —</w:t>
@@ -3531,11 +3219,7 @@
     </w:p>
     <w:p>
       <w:pPr>
-        <w:numPr>
-          <w:ilvl w:val="0"/>
-          <w:numId w:val="1011"/>
-        </w:numPr>
-        <w:pStyle w:val="Compact"/>
+        <w:pStyle w:val="BodyText"/>
       </w:pPr>
       <w:r>
         <w:t xml:space="preserve">2003 —</w:t>
@@ -3549,11 +3233,7 @@
     </w:p>
     <w:p>
       <w:pPr>
-        <w:numPr>
-          <w:ilvl w:val="0"/>
-          <w:numId w:val="1011"/>
-        </w:numPr>
-        <w:pStyle w:val="Compact"/>
+        <w:pStyle w:val="BodyText"/>
       </w:pPr>
       <w:r>
         <w:t xml:space="preserve">2003 —</w:t>
@@ -3567,11 +3247,7 @@
     </w:p>
     <w:p>
       <w:pPr>
-        <w:numPr>
-          <w:ilvl w:val="0"/>
-          <w:numId w:val="1011"/>
-        </w:numPr>
-        <w:pStyle w:val="Compact"/>
+        <w:pStyle w:val="BodyText"/>
       </w:pPr>
       <w:r>
         <w:t xml:space="preserve">2003 —</w:t>
@@ -3585,11 +3261,7 @@
     </w:p>
     <w:p>
       <w:pPr>
-        <w:numPr>
-          <w:ilvl w:val="0"/>
-          <w:numId w:val="1011"/>
-        </w:numPr>
-        <w:pStyle w:val="Compact"/>
+        <w:pStyle w:val="BodyText"/>
       </w:pPr>
       <w:r>
         <w:t xml:space="preserve">2003 —</w:t>
@@ -3603,11 +3275,7 @@
     </w:p>
     <w:p>
       <w:pPr>
-        <w:numPr>
-          <w:ilvl w:val="0"/>
-          <w:numId w:val="1011"/>
-        </w:numPr>
-        <w:pStyle w:val="Compact"/>
+        <w:pStyle w:val="BodyText"/>
       </w:pPr>
       <w:r>
         <w:t xml:space="preserve">2002 —</w:t>
@@ -3621,11 +3289,7 @@
     </w:p>
     <w:p>
       <w:pPr>
-        <w:numPr>
-          <w:ilvl w:val="0"/>
-          <w:numId w:val="1011"/>
-        </w:numPr>
-        <w:pStyle w:val="Compact"/>
+        <w:pStyle w:val="BodyText"/>
       </w:pPr>
       <w:r>
         <w:t xml:space="preserve">2001 —</w:t>
@@ -3639,11 +3303,7 @@
     </w:p>
     <w:p>
       <w:pPr>
-        <w:numPr>
-          <w:ilvl w:val="0"/>
-          <w:numId w:val="1011"/>
-        </w:numPr>
-        <w:pStyle w:val="Compact"/>
+        <w:pStyle w:val="BodyText"/>
       </w:pPr>
       <w:r>
         <w:t xml:space="preserve">2000 —</w:t>
@@ -3657,11 +3317,7 @@
     </w:p>
     <w:p>
       <w:pPr>
-        <w:numPr>
-          <w:ilvl w:val="0"/>
-          <w:numId w:val="1011"/>
-        </w:numPr>
-        <w:pStyle w:val="Compact"/>
+        <w:pStyle w:val="BodyText"/>
       </w:pPr>
       <w:r>
         <w:t xml:space="preserve">2000 —</w:t>
@@ -3675,11 +3331,7 @@
     </w:p>
     <w:p>
       <w:pPr>
-        <w:numPr>
-          <w:ilvl w:val="0"/>
-          <w:numId w:val="1011"/>
-        </w:numPr>
-        <w:pStyle w:val="Compact"/>
+        <w:pStyle w:val="BodyText"/>
       </w:pPr>
       <w:r>
         <w:t xml:space="preserve">1999 —</w:t>
@@ -3693,11 +3345,7 @@
     </w:p>
     <w:p>
       <w:pPr>
-        <w:numPr>
-          <w:ilvl w:val="0"/>
-          <w:numId w:val="1011"/>
-        </w:numPr>
-        <w:pStyle w:val="Compact"/>
+        <w:pStyle w:val="BodyText"/>
       </w:pPr>
       <w:r>
         <w:t xml:space="preserve">1999 —</w:t>
@@ -3721,11 +3369,7 @@
     </w:p>
     <w:p>
       <w:pPr>
-        <w:numPr>
-          <w:ilvl w:val="0"/>
-          <w:numId w:val="1012"/>
-        </w:numPr>
-        <w:pStyle w:val="Compact"/>
+        <w:pStyle w:val="FirstParagraph"/>
       </w:pPr>
       <w:r>
         <w:t xml:space="preserve">2003 —</w:t>
@@ -3749,11 +3393,7 @@
     </w:p>
     <w:p>
       <w:pPr>
-        <w:numPr>
-          <w:ilvl w:val="0"/>
-          <w:numId w:val="1012"/>
-        </w:numPr>
-        <w:pStyle w:val="Compact"/>
+        <w:pStyle w:val="BodyText"/>
       </w:pPr>
       <w:r>
         <w:t xml:space="preserve">2003 —</w:t>
@@ -3767,11 +3407,7 @@
     </w:p>
     <w:p>
       <w:pPr>
-        <w:numPr>
-          <w:ilvl w:val="0"/>
-          <w:numId w:val="1012"/>
-        </w:numPr>
-        <w:pStyle w:val="Compact"/>
+        <w:pStyle w:val="BodyText"/>
       </w:pPr>
       <w:r>
         <w:t xml:space="preserve">2003 —</w:t>
@@ -3785,11 +3421,7 @@
     </w:p>
     <w:p>
       <w:pPr>
-        <w:numPr>
-          <w:ilvl w:val="0"/>
-          <w:numId w:val="1012"/>
-        </w:numPr>
-        <w:pStyle w:val="Compact"/>
+        <w:pStyle w:val="BodyText"/>
       </w:pPr>
       <w:r>
         <w:t xml:space="preserve">2002 —</w:t>
@@ -3813,11 +3445,7 @@
     </w:p>
     <w:p>
       <w:pPr>
-        <w:numPr>
-          <w:ilvl w:val="0"/>
-          <w:numId w:val="1013"/>
-        </w:numPr>
-        <w:pStyle w:val="Compact"/>
+        <w:pStyle w:val="FirstParagraph"/>
       </w:pPr>
       <w:r>
         <w:t xml:space="preserve">2025 —</w:t>
@@ -3831,11 +3459,7 @@
     </w:p>
     <w:p>
       <w:pPr>
-        <w:numPr>
-          <w:ilvl w:val="0"/>
-          <w:numId w:val="1013"/>
-        </w:numPr>
-        <w:pStyle w:val="Compact"/>
+        <w:pStyle w:val="BodyText"/>
       </w:pPr>
       <w:r>
         <w:t xml:space="preserve">2023 —</w:t>
@@ -3849,11 +3473,7 @@
     </w:p>
     <w:p>
       <w:pPr>
-        <w:numPr>
-          <w:ilvl w:val="0"/>
-          <w:numId w:val="1013"/>
-        </w:numPr>
-        <w:pStyle w:val="Compact"/>
+        <w:pStyle w:val="BodyText"/>
       </w:pPr>
       <w:r>
         <w:t xml:space="preserve">2022 —</w:t>
@@ -3867,11 +3487,7 @@
     </w:p>
     <w:p>
       <w:pPr>
-        <w:numPr>
-          <w:ilvl w:val="0"/>
-          <w:numId w:val="1013"/>
-        </w:numPr>
-        <w:pStyle w:val="Compact"/>
+        <w:pStyle w:val="BodyText"/>
       </w:pPr>
       <w:r>
         <w:t xml:space="preserve">2022 —</w:t>
@@ -3885,11 +3501,7 @@
     </w:p>
     <w:p>
       <w:pPr>
-        <w:numPr>
-          <w:ilvl w:val="0"/>
-          <w:numId w:val="1013"/>
-        </w:numPr>
-        <w:pStyle w:val="Compact"/>
+        <w:pStyle w:val="BodyText"/>
       </w:pPr>
       <w:r>
         <w:t xml:space="preserve">2008 —</w:t>
@@ -3903,11 +3515,7 @@
     </w:p>
     <w:p>
       <w:pPr>
-        <w:numPr>
-          <w:ilvl w:val="0"/>
-          <w:numId w:val="1013"/>
-        </w:numPr>
-        <w:pStyle w:val="Compact"/>
+        <w:pStyle w:val="BodyText"/>
       </w:pPr>
       <w:r>
         <w:t xml:space="preserve">2007 —</w:t>
@@ -3931,11 +3539,7 @@
     </w:p>
     <w:p>
       <w:pPr>
-        <w:numPr>
-          <w:ilvl w:val="0"/>
-          <w:numId w:val="1014"/>
-        </w:numPr>
-        <w:pStyle w:val="Compact"/>
+        <w:pStyle w:val="FirstParagraph"/>
       </w:pPr>
       <w:r>
         <w:t xml:space="preserve">Manchester Metropolitan University Library, UK</w:t>
@@ -3943,11 +3547,7 @@
     </w:p>
     <w:p>
       <w:pPr>
-        <w:numPr>
-          <w:ilvl w:val="0"/>
-          <w:numId w:val="1014"/>
-        </w:numPr>
-        <w:pStyle w:val="Compact"/>
+        <w:pStyle w:val="BodyText"/>
       </w:pPr>
       <w:r>
         <w:t xml:space="preserve">Frans Masereel Centrum, Kasterlee, Belgium</w:t>
@@ -3955,11 +3555,7 @@
     </w:p>
     <w:p>
       <w:pPr>
-        <w:numPr>
-          <w:ilvl w:val="0"/>
-          <w:numId w:val="1014"/>
-        </w:numPr>
-        <w:pStyle w:val="Compact"/>
+        <w:pStyle w:val="BodyText"/>
       </w:pPr>
       <w:r>
         <w:t xml:space="preserve">Museum for Fine Arts, Antwerp, Belgium</w:t>
@@ -3967,11 +3563,7 @@
     </w:p>
     <w:p>
       <w:pPr>
-        <w:numPr>
-          <w:ilvl w:val="0"/>
-          <w:numId w:val="1014"/>
-        </w:numPr>
-        <w:pStyle w:val="Compact"/>
+        <w:pStyle w:val="BodyText"/>
       </w:pPr>
       <w:r>
         <w:t xml:space="preserve">KUMU (The Art Museum of Estonia), Tallinn, Estonia</w:t>
@@ -3979,11 +3571,7 @@
     </w:p>
     <w:p>
       <w:pPr>
-        <w:numPr>
-          <w:ilvl w:val="0"/>
-          <w:numId w:val="1014"/>
-        </w:numPr>
-        <w:pStyle w:val="Compact"/>
+        <w:pStyle w:val="BodyText"/>
       </w:pPr>
       <w:r>
         <w:t xml:space="preserve">Utah Museum of Fine Arts, Salt Lake City, Utah</w:t>
@@ -3991,11 +3579,7 @@
     </w:p>
     <w:p>
       <w:pPr>
-        <w:numPr>
-          <w:ilvl w:val="0"/>
-          <w:numId w:val="1014"/>
-        </w:numPr>
-        <w:pStyle w:val="Compact"/>
+        <w:pStyle w:val="BodyText"/>
       </w:pPr>
       <w:r>
         <w:t xml:space="preserve">Gravat.Olot, Olot, Spain</w:t>
@@ -4003,11 +3587,7 @@
     </w:p>
     <w:p>
       <w:pPr>
-        <w:numPr>
-          <w:ilvl w:val="0"/>
-          <w:numId w:val="1014"/>
-        </w:numPr>
-        <w:pStyle w:val="Compact"/>
+        <w:pStyle w:val="BodyText"/>
       </w:pPr>
       <w:r>
         <w:t xml:space="preserve">Center for Book Arts, New York</w:t>
@@ -4016,13 +3596,15 @@
     <w:bookmarkEnd w:id="45"/>
     <w:p>
       <w:pPr>
-        <w:pStyle w:val="FirstParagraph"/>
+        <w:pStyle w:val="BodyText"/>
       </w:pPr>
       <w:r>
         <w:t xml:space="preserve">updated: 5 May 2026</w:t>
       </w:r>
     </w:p>
-    <w:sectPr/>
+    <w:sectPr>
+      <w:pgMar w:bottom="1440" w:left="1417" w:right="1417" w:top="1080"/>
+    </w:sectPr>
   </w:body>
 </w:document>
 </file>
@@ -4128,126 +3710,8 @@
       </w:pPr>
     </w:lvl>
   </w:abstractNum>
-  <w:abstractNum w:abstractNumId="991">
-    <w:nsid w:val="A991"/>
-    <w:multiLevelType w:val="multilevel"/>
-    <w:lvl w:ilvl="0">
-      <w:numFmt w:val="bullet"/>
-      <w:lvlText w:val="•"/>
-      <w:lvlJc w:val="left"/>
-      <w:pPr>
-        <w:ind w:left="720" w:hanging="480"/>
-      </w:pPr>
-    </w:lvl>
-    <w:lvl w:ilvl="1">
-      <w:numFmt w:val="bullet"/>
-      <w:lvlText w:val="–"/>
-      <w:lvlJc w:val="left"/>
-      <w:pPr>
-        <w:ind w:left="1440" w:hanging="480"/>
-      </w:pPr>
-    </w:lvl>
-    <w:lvl w:ilvl="2">
-      <w:numFmt w:val="bullet"/>
-      <w:lvlText w:val="•"/>
-      <w:lvlJc w:val="left"/>
-      <w:pPr>
-        <w:ind w:left="2160" w:hanging="480"/>
-      </w:pPr>
-    </w:lvl>
-    <w:lvl w:ilvl="3">
-      <w:numFmt w:val="bullet"/>
-      <w:lvlText w:val="–"/>
-      <w:lvlJc w:val="left"/>
-      <w:pPr>
-        <w:ind w:left="2880" w:hanging="480"/>
-      </w:pPr>
-    </w:lvl>
-    <w:lvl w:ilvl="4">
-      <w:numFmt w:val="bullet"/>
-      <w:lvlText w:val="•"/>
-      <w:lvlJc w:val="left"/>
-      <w:pPr>
-        <w:ind w:left="3600" w:hanging="480"/>
-      </w:pPr>
-    </w:lvl>
-    <w:lvl w:ilvl="5">
-      <w:numFmt w:val="bullet"/>
-      <w:lvlText w:val="–"/>
-      <w:lvlJc w:val="left"/>
-      <w:pPr>
-        <w:ind w:left="4320" w:hanging="480"/>
-      </w:pPr>
-    </w:lvl>
-    <w:lvl w:ilvl="6">
-      <w:numFmt w:val="bullet"/>
-      <w:lvlText w:val="•"/>
-      <w:lvlJc w:val="left"/>
-      <w:pPr>
-        <w:ind w:left="5040" w:hanging="480"/>
-      </w:pPr>
-    </w:lvl>
-    <w:lvl w:ilvl="7">
-      <w:numFmt w:val="bullet"/>
-      <w:lvlText w:val="–"/>
-      <w:lvlJc w:val="left"/>
-      <w:pPr>
-        <w:ind w:left="5760" w:hanging="480"/>
-      </w:pPr>
-    </w:lvl>
-    <w:lvl w:ilvl="8">
-      <w:numFmt w:val="bullet"/>
-      <w:lvlText w:val="•"/>
-      <w:lvlJc w:val="left"/>
-      <w:pPr>
-        <w:ind w:left="6480" w:hanging="480"/>
-      </w:pPr>
-    </w:lvl>
-  </w:abstractNum>
   <w:num w:numId="1000">
     <w:abstractNumId w:val="990"/>
-  </w:num>
-  <w:num w:numId="1001">
-    <w:abstractNumId w:val="991"/>
-  </w:num>
-  <w:num w:numId="1002">
-    <w:abstractNumId w:val="991"/>
-  </w:num>
-  <w:num w:numId="1003">
-    <w:abstractNumId w:val="991"/>
-  </w:num>
-  <w:num w:numId="1004">
-    <w:abstractNumId w:val="991"/>
-  </w:num>
-  <w:num w:numId="1005">
-    <w:abstractNumId w:val="991"/>
-  </w:num>
-  <w:num w:numId="1006">
-    <w:abstractNumId w:val="991"/>
-  </w:num>
-  <w:num w:numId="1007">
-    <w:abstractNumId w:val="991"/>
-  </w:num>
-  <w:num w:numId="1008">
-    <w:abstractNumId w:val="991"/>
-  </w:num>
-  <w:num w:numId="1009">
-    <w:abstractNumId w:val="991"/>
-  </w:num>
-  <w:num w:numId="1010">
-    <w:abstractNumId w:val="991"/>
-  </w:num>
-  <w:num w:numId="1011">
-    <w:abstractNumId w:val="991"/>
-  </w:num>
-  <w:num w:numId="1012">
-    <w:abstractNumId w:val="991"/>
-  </w:num>
-  <w:num w:numId="1013">
-    <w:abstractNumId w:val="991"/>
-  </w:num>
-  <w:num w:numId="1014">
-    <w:abstractNumId w:val="991"/>
   </w:num>
 </w:numbering>
 </file>
@@ -4271,31 +3735,73 @@
   </w:docDefaults>
   <w:latentStyles w:count="276" w:defLockedState="0" w:defQFormat="0" w:defSemiHidden="0" w:defUIPriority="0" w:defUnhideWhenUsed="0"/>
   <w:style w:default="1" w:styleId="Normal" w:type="paragraph">
+    <w:rFonts w:ascii="Calibri" w:cs="Calibri" w:hAnsi="Calibri"/>
     <w:name w:val="Normal"/>
     <w:qFormat/>
+    <w:pPr>
+      <w:spacing w:after="60" w:before="0" w:line="336" w:lineRule="auto"/>
+      <w:widowControl w:val="0"/>
+      <w:pageBreakBefore w:val="0"/>
+    </w:pPr>
+    <w:rPr>
+      <w:rFonts w:ascii="Calibri" w:hAnsi="Calibri"/>
+      <w:b w:val="0"/>
+      <w:color w:val="444444"/>
+      <w:sz w:val="20"/>
+    </w:rPr>
   </w:style>
   <w:style w:styleId="BodyText" w:type="paragraph">
+    <w:rFonts w:ascii="Calibri" w:cs="Calibri" w:hAnsi="Calibri"/>
     <w:name w:val="Body Text"/>
     <w:basedOn w:val="Normal"/>
     <w:link w:val="BodyTextChar"/>
     <w:pPr>
-      <w:spacing w:after="180" w:before="180"/>
+      <w:spacing w:after="60" w:before="0" w:line="336" w:lineRule="auto"/>
+      <w:widowControl w:val="0"/>
+      <w:pageBreakBefore w:val="0"/>
     </w:pPr>
     <w:qFormat/>
+    <w:rPr>
+      <w:rFonts w:ascii="Calibri" w:hAnsi="Calibri"/>
+      <w:b w:val="0"/>
+      <w:color w:val="444444"/>
+      <w:sz w:val="20"/>
+    </w:rPr>
   </w:style>
   <w:style w:customStyle="1" w:styleId="FirstParagraph" w:type="paragraph">
+    <w:rFonts w:ascii="Calibri" w:cs="Calibri" w:hAnsi="Calibri"/>
     <w:name w:val="First Paragraph"/>
     <w:basedOn w:val="BodyText"/>
     <w:next w:val="BodyText"/>
     <w:qFormat/>
+    <w:pPr>
+      <w:spacing w:after="60" w:before="0" w:line="336" w:lineRule="auto"/>
+      <w:widowControl w:val="0"/>
+      <w:pageBreakBefore w:val="0"/>
+    </w:pPr>
+    <w:rPr>
+      <w:rFonts w:ascii="Calibri" w:hAnsi="Calibri"/>
+      <w:b w:val="0"/>
+      <w:color w:val="444444"/>
+      <w:sz w:val="20"/>
+    </w:rPr>
   </w:style>
   <w:style w:customStyle="1" w:styleId="Compact" w:type="paragraph">
+    <w:rFonts w:ascii="Calibri" w:cs="Calibri" w:hAnsi="Calibri"/>
     <w:name w:val="Compact"/>
     <w:basedOn w:val="BodyText"/>
     <w:qFormat/>
     <w:pPr>
-      <w:spacing w:after="36" w:before="36"/>
+      <w:spacing w:after="60" w:before="0" w:line="336" w:lineRule="auto"/>
+      <w:widowControl w:val="0"/>
+      <w:pageBreakBefore w:val="0"/>
     </w:pPr>
+    <w:rPr>
+      <w:rFonts w:ascii="Calibri" w:hAnsi="Calibri"/>
+      <w:b w:val="0"/>
+      <w:color w:val="444444"/>
+      <w:sz w:val="20"/>
+    </w:rPr>
   </w:style>
   <w:style w:styleId="Title" w:type="paragraph">
     <w:name w:val="Title"/>
@@ -4305,7 +3811,7 @@
     <w:pPr>
       <w:keepNext/>
       <w:keepLines/>
-      <w:spacing w:after="240" w:before="480"/>
+      <w:spacing w:after="0" w:before="0" w:line="312" w:lineRule="auto"/>
       <w:jc w:val="center"/>
     </w:pPr>
     <w:rPr>
@@ -4313,7 +3819,7 @@
       <w:b/>
       <w:bCs/>
       <w:color w:themeColor="accent1" w:themeShade="B5" w:val="345A8A"/>
-      <w:sz w:val="36"/>
+      <w:sz w:val="2"/>
       <w:szCs w:val="36"/>
     </w:rPr>
   </w:style>
@@ -4396,27 +3902,33 @@
     <w:rPr/>
   </w:style>
   <w:style w:styleId="Heading1" w:type="paragraph">
+    <w:rFonts w:ascii="Georgia" w:cs="Georgia" w:hAnsi="Georgia"/>
     <w:name w:val="Heading 1"/>
     <w:basedOn w:val="Normal"/>
     <w:next w:val="BodyText"/>
     <w:uiPriority w:val="9"/>
     <w:qFormat/>
     <w:pPr>
-      <w:keepNext/>
+      <w:keepNext w:val="1"/>
       <w:keepLines/>
-      <w:spacing w:after="0" w:before="480"/>
+      <w:spacing w:after="160" w:before="0" w:line="264" w:lineRule="auto"/>
       <w:outlineLvl w:val="0"/>
+      <w:widowControl w:val="0"/>
+      <w:pageBreakBefore w:val="0"/>
     </w:pPr>
     <w:rPr>
-      <w:rFonts w:asciiTheme="majorHAnsi" w:cstheme="majorBidi" w:eastAsiaTheme="majorEastAsia" w:hAnsiTheme="majorHAnsi"/>
-      <w:b/>
+      <w:rFonts w:ascii="Georgia" w:asciiTheme="majorHAnsi" w:cstheme="majorBidi" w:eastAsiaTheme="majorEastAsia" w:hAnsi="Georgia" w:hAnsiTheme="majorHAnsi"/>
+      <w:b w:val="0"/>
       <w:bCs/>
-      <w:color w:themeColor="accent1" w:val="4F81BD"/>
-      <w:sz w:val="32"/>
+      <w:i w:val="0"/>
+      <w:caps w:val="0"/>
+      <w:color w:val="1A1A1A"/>
+      <w:sz w:val="44"/>
       <w:szCs w:val="32"/>
     </w:rPr>
   </w:style>
   <w:style w:styleId="Heading2" w:type="paragraph">
+    <w:rFonts w:ascii="Calibri" w:cs="Calibri" w:hAnsi="Calibri"/>
     <w:name w:val="Heading 2"/>
     <w:basedOn w:val="Normal"/>
     <w:next w:val="BodyText"/>
@@ -4424,21 +3936,29 @@
     <w:unhideWhenUsed/>
     <w:qFormat/>
     <w:pPr>
-      <w:keepNext/>
+      <w:keepNext w:val="1"/>
       <w:keepLines/>
-      <w:spacing w:after="0" w:before="200"/>
+      <w:spacing w:after="80" w:before="280" w:line="240" w:lineRule="auto"/>
       <w:outlineLvl w:val="1"/>
+      <w:pBdr>
+        <w:top w:color="cccccc" w:space="4" w:sz="4" w:val="single"/>
+      </w:pBdr>
+      <w:widowControl w:val="0"/>
+      <w:pageBreakBefore w:val="0"/>
     </w:pPr>
     <w:rPr>
-      <w:rFonts w:asciiTheme="majorHAnsi" w:cstheme="majorBidi" w:eastAsiaTheme="majorEastAsia" w:hAnsiTheme="majorHAnsi"/>
-      <w:b/>
+      <w:rFonts w:ascii="Calibri" w:asciiTheme="majorHAnsi" w:cstheme="majorBidi" w:eastAsiaTheme="majorEastAsia" w:hAnsi="Calibri" w:hAnsiTheme="majorHAnsi"/>
+      <w:b w:val="0"/>
       <w:bCs/>
-      <w:color w:themeColor="accent1" w:val="4F81BD"/>
-      <w:sz w:val="28"/>
+      <w:i w:val="0"/>
+      <w:caps/>
+      <w:color w:val="999999"/>
+      <w:sz w:val="24"/>
       <w:szCs w:val="28"/>
     </w:rPr>
   </w:style>
   <w:style w:styleId="Heading3" w:type="paragraph">
+    <w:rFonts w:ascii="Calibri" w:cs="Calibri" w:hAnsi="Calibri"/>
     <w:name w:val="Heading 3"/>
     <w:basedOn w:val="Normal"/>
     <w:next w:val="BodyText"/>
@@ -4446,21 +3966,26 @@
     <w:unhideWhenUsed/>
     <w:qFormat/>
     <w:pPr>
-      <w:keepNext/>
+      <w:keepNext w:val="1"/>
       <w:keepLines/>
-      <w:spacing w:after="0" w:before="200"/>
+      <w:spacing w:after="60" w:before="200" w:line="240" w:lineRule="auto"/>
       <w:outlineLvl w:val="2"/>
+      <w:widowControl w:val="0"/>
+      <w:pageBreakBefore w:val="0"/>
     </w:pPr>
     <w:rPr>
-      <w:rFonts w:asciiTheme="majorHAnsi" w:cstheme="majorBidi" w:eastAsiaTheme="majorEastAsia" w:hAnsiTheme="majorHAnsi"/>
-      <w:b/>
+      <w:rFonts w:ascii="Calibri" w:asciiTheme="majorHAnsi" w:cstheme="majorBidi" w:eastAsiaTheme="majorEastAsia" w:hAnsi="Calibri" w:hAnsiTheme="majorHAnsi"/>
+      <w:b w:val="0"/>
       <w:bCs/>
-      <w:color w:themeColor="accent1" w:val="4F81BD"/>
-      <w:sz w:val="24"/>
+      <w:i w:val="0"/>
+      <w:caps/>
+      <w:color w:val="999999"/>
+      <w:sz w:val="21"/>
       <w:szCs w:val="24"/>
     </w:rPr>
   </w:style>
   <w:style w:styleId="Heading4" w:type="paragraph">
+    <w:rFonts w:ascii="Calibri" w:cs="Calibri" w:hAnsi="Calibri"/>
     <w:name w:val="Heading 4"/>
     <w:basedOn w:val="Normal"/>
     <w:next w:val="BodyText"/>
@@ -4468,17 +3993,21 @@
     <w:unhideWhenUsed/>
     <w:qFormat/>
     <w:pPr>
-      <w:keepNext/>
+      <w:keepNext w:val="1"/>
       <w:keepLines/>
-      <w:spacing w:after="0" w:before="200"/>
+      <w:spacing w:after="20" w:before="120" w:line="312" w:lineRule="auto"/>
       <w:outlineLvl w:val="3"/>
+      <w:widowControl w:val="0"/>
+      <w:pageBreakBefore w:val="0"/>
     </w:pPr>
     <w:rPr>
-      <w:rFonts w:asciiTheme="majorHAnsi" w:cstheme="majorBidi" w:eastAsiaTheme="majorEastAsia" w:hAnsiTheme="majorHAnsi"/>
-      <w:i/>
+      <w:rFonts w:ascii="Calibri" w:asciiTheme="majorHAnsi" w:cstheme="majorBidi" w:eastAsiaTheme="majorEastAsia" w:hAnsi="Calibri" w:hAnsiTheme="majorHAnsi"/>
+      <w:i w:val="0"/>
+      <w:b/>
       <w:bCs/>
-      <w:color w:themeColor="accent1" w:val="4F81BD"/>
-      <w:sz w:val="24"/>
+      <w:caps w:val="0"/>
+      <w:color w:val="1A1A1A"/>
+      <w:sz w:val="20"/>
       <w:szCs w:val="24"/>
     </w:rPr>
   </w:style>
@@ -4717,7 +4246,8 @@
     <w:name w:val="Hyperlink"/>
     <w:basedOn w:val="BodyTextChar"/>
     <w:rPr>
-      <w:color w:themeColor="accent1" w:val="4F81BD"/>
+      <w:color w:val="555555"/>
+      <w:u w:val="none"/>
     </w:rPr>
   </w:style>
   <w:style w:styleId="TOCHeading" w:type="paragraph">

</xml_diff>

<commit_message>
updates: the outputs, html, pdfs, and docx
</commit_message>
<xml_diff>
--- a/docx/Atkinson_Academic.docx
+++ b/docx/Atkinson_Academic.docx
@@ -231,7 +231,7 @@
               <w:jc w:val="left"/>
             </w:pPr>
             <w:r>
-              <w:t xml:space="preserve">Spring – Summer 2017</w:t>
+              <w:t xml:space="preserve">2017</w:t>
             </w:r>
           </w:p>
         </w:tc>
@@ -265,7 +265,7 @@
               <w:jc w:val="left"/>
             </w:pPr>
             <w:r>
-              <w:t xml:space="preserve">Oct 2000 – May 2004</w:t>
+              <w:t xml:space="preserve">2000–04</w:t>
             </w:r>
           </w:p>
         </w:tc>
@@ -289,17 +289,7 @@
               <w:jc w:val="left"/>
             </w:pPr>
             <w:r>
-              <w:t xml:space="preserve">Ph.D. —</w:t>
-            </w:r>
-            <w:r>
-              <w:t xml:space="preserve"> </w:t>
-            </w:r>
-            <w:r>
-              <w:rPr>
-                <w:iCs/>
-                <w:i/>
-              </w:rPr>
-              <w:t xml:space="preserve">"The creation of digital fine art print through the Woodburytype model"</w:t>
+              <w:t xml:space="preserve">Ph.D. — "The creation of digital fine art print through the Woodburytype model"</w:t>
             </w:r>
           </w:p>
         </w:tc>
@@ -313,7 +303,7 @@
               <w:jc w:val="left"/>
             </w:pPr>
             <w:r>
-              <w:t xml:space="preserve">Sept 1999 – June 2000</w:t>
+              <w:t xml:space="preserve">1999–2000</w:t>
             </w:r>
           </w:p>
         </w:tc>
@@ -351,7 +341,7 @@
               <w:jc w:val="left"/>
             </w:pPr>
             <w:r>
-              <w:t xml:space="preserve">Oct 1993 – July 1996</w:t>
+              <w:t xml:space="preserve">1993–96</w:t>
             </w:r>
           </w:p>
         </w:tc>
@@ -406,12 +396,6 @@
         <w:t xml:space="preserve"> </w:t>
       </w:r>
       <w:r>
-        <w:t xml:space="preserve">—</w:t>
-      </w:r>
-      <w:r>
-        <w:t xml:space="preserve"> </w:t>
-      </w:r>
-      <w:r>
         <w:rPr>
           <w:iCs/>
           <w:i/>
@@ -466,17 +450,11 @@
         <w:t xml:space="preserve"> </w:t>
       </w:r>
       <w:r>
-        <w:t xml:space="preserve">—</w:t>
-      </w:r>
-      <w:r>
-        <w:t xml:space="preserve"> </w:t>
-      </w:r>
-      <w:r>
         <w:rPr>
           <w:iCs/>
           <w:i/>
         </w:rPr>
-        <w:t xml:space="preserve">2017–2019</w:t>
+        <w:t xml:space="preserve">2017–19</w:t>
       </w:r>
     </w:p>
     <w:p>
@@ -497,12 +475,6 @@
           <w:b/>
         </w:rPr>
         <w:t xml:space="preserve">Institute for the Advancement of Philosophy for Children</w:t>
-      </w:r>
-      <w:r>
-        <w:t xml:space="preserve"> </w:t>
-      </w:r>
-      <w:r>
-        <w:t xml:space="preserve">—</w:t>
       </w:r>
       <w:r>
         <w:t xml:space="preserve"> </w:t>
@@ -586,7 +558,7 @@
               <w:jc w:val="left"/>
             </w:pPr>
             <w:r>
-              <w:t xml:space="preserve">Course</w:t>
+              <w:t xml:space="preserve">Code</w:t>
             </w:r>
           </w:p>
         </w:tc>
@@ -602,7 +574,7 @@
               <w:jc w:val="left"/>
             </w:pPr>
             <w:r>
-              <w:t xml:space="preserve">Title</w:t>
+              <w:t xml:space="preserve">Course</w:t>
             </w:r>
           </w:p>
         </w:tc>
@@ -616,7 +588,7 @@
               <w:jc w:val="left"/>
             </w:pPr>
             <w:r>
-              <w:t xml:space="preserve">2004–23</w:t>
+              <w:t xml:space="preserve">2004–2023</w:t>
             </w:r>
           </w:p>
         </w:tc>
@@ -654,7 +626,7 @@
               <w:jc w:val="left"/>
             </w:pPr>
             <w:r>
-              <w:t xml:space="preserve">2005–19</w:t>
+              <w:t xml:space="preserve">2005–2019</w:t>
             </w:r>
           </w:p>
         </w:tc>
@@ -814,7 +786,7 @@
               <w:jc w:val="left"/>
             </w:pPr>
             <w:r>
-              <w:t xml:space="preserve">Course</w:t>
+              <w:t xml:space="preserve">Code</w:t>
             </w:r>
           </w:p>
         </w:tc>
@@ -830,7 +802,7 @@
               <w:jc w:val="left"/>
             </w:pPr>
             <w:r>
-              <w:t xml:space="preserve">Title</w:t>
+              <w:t xml:space="preserve">Course</w:t>
             </w:r>
           </w:p>
         </w:tc>
@@ -844,7 +816,7 @@
               <w:jc w:val="left"/>
             </w:pPr>
             <w:r>
-              <w:t xml:space="preserve">2005–17</w:t>
+              <w:t xml:space="preserve">2005–2017</w:t>
             </w:r>
           </w:p>
         </w:tc>
@@ -920,7 +892,7 @@
               <w:jc w:val="left"/>
             </w:pPr>
             <w:r>
-              <w:t xml:space="preserve">2009–27</w:t>
+              <w:t xml:space="preserve">2009–2027</w:t>
             </w:r>
           </w:p>
         </w:tc>
@@ -958,7 +930,7 @@
               <w:jc w:val="left"/>
             </w:pPr>
             <w:r>
-              <w:t xml:space="preserve">2019–24</w:t>
+              <w:t xml:space="preserve">2019–2024</w:t>
             </w:r>
           </w:p>
         </w:tc>
@@ -1042,7 +1014,7 @@
               <w:jc w:val="left"/>
             </w:pPr>
             <w:r>
-              <w:t xml:space="preserve">Course</w:t>
+              <w:t xml:space="preserve">Code</w:t>
             </w:r>
           </w:p>
         </w:tc>
@@ -1058,7 +1030,7 @@
               <w:jc w:val="left"/>
             </w:pPr>
             <w:r>
-              <w:t xml:space="preserve">Title</w:t>
+              <w:t xml:space="preserve">Course</w:t>
             </w:r>
           </w:p>
         </w:tc>
@@ -1072,7 +1044,7 @@
               <w:jc w:val="left"/>
             </w:pPr>
             <w:r>
-              <w:t xml:space="preserve">2019–23</w:t>
+              <w:t xml:space="preserve">2019–2023</w:t>
             </w:r>
           </w:p>
         </w:tc>
@@ -1194,7 +1166,7 @@
               <w:jc w:val="left"/>
             </w:pPr>
             <w:r>
-              <w:t xml:space="preserve">Course</w:t>
+              <w:t xml:space="preserve">Code</w:t>
             </w:r>
           </w:p>
         </w:tc>
@@ -1210,7 +1182,7 @@
               <w:jc w:val="left"/>
             </w:pPr>
             <w:r>
-              <w:t xml:space="preserve">Title</w:t>
+              <w:t xml:space="preserve">Course</w:t>
             </w:r>
           </w:p>
         </w:tc>
@@ -1224,7 +1196,7 @@
               <w:jc w:val="left"/>
             </w:pPr>
             <w:r>
-              <w:t xml:space="preserve">2017–19, '22–23</w:t>
+              <w:t xml:space="preserve">2017–2023</w:t>
             </w:r>
           </w:p>
         </w:tc>
@@ -1464,6 +1436,16 @@
         </w:rPr>
         <w:t xml:space="preserve">Passaic Public Schools Digital Art CTE Advisory Committee</w:t>
       </w:r>
+      <w:r>
+        <w:t xml:space="preserve"> </w:t>
+      </w:r>
+      <w:r>
+        <w:rPr>
+          <w:iCs/>
+          <w:i/>
+        </w:rPr>
+        <w:t xml:space="preserve">2020–24</w:t>
+      </w:r>
     </w:p>
     <w:p>
       <w:pPr>
@@ -1490,69 +1472,39 @@
         <w:pStyle w:val="BodyText"/>
       </w:pPr>
       <w:r>
-        <w:t xml:space="preserve">2023 —</w:t>
-      </w:r>
-      <w:r>
-        <w:t xml:space="preserve"> </w:t>
-      </w:r>
-      <w:r>
-        <w:t xml:space="preserve">Ocean Memory Project, Remembering/Writing, Friday Harbor Labs, San Juan Island, University of Washington, WA</w:t>
-      </w:r>
-    </w:p>
-    <w:p>
-      <w:pPr>
-        <w:pStyle w:val="BodyText"/>
-      </w:pPr>
-      <w:r>
-        <w:t xml:space="preserve">2022 —</w:t>
-      </w:r>
-      <w:r>
-        <w:t xml:space="preserve"> </w:t>
-      </w:r>
-      <w:r>
-        <w:t xml:space="preserve">Ocean Memory Project, Sense Submerged Workshop, Puerto Morelos, Mexico</w:t>
-      </w:r>
-    </w:p>
-    <w:p>
-      <w:pPr>
-        <w:pStyle w:val="BodyText"/>
-      </w:pPr>
-      <w:r>
-        <w:t xml:space="preserve">2009 —</w:t>
-      </w:r>
-      <w:r>
-        <w:t xml:space="preserve"> </w:t>
-      </w:r>
-      <w:r>
-        <w:t xml:space="preserve">Society for Photographic Education, Mid-Atlantic Region Annual conference, Montclair State University, Montclair, NJ</w:t>
-      </w:r>
-    </w:p>
-    <w:p>
-      <w:pPr>
-        <w:pStyle w:val="BodyText"/>
-      </w:pPr>
-      <w:r>
-        <w:t xml:space="preserve">2008 —</w:t>
-      </w:r>
-      <w:r>
-        <w:t xml:space="preserve"> </w:t>
-      </w:r>
-      <w:r>
-        <w:t xml:space="preserve">Society for Photographic Education, Mid-Atlantic Region Annual conference, Carnegie Mellon University, Pittsburgh, PA</w:t>
-      </w:r>
-    </w:p>
-    <w:p>
-      <w:pPr>
-        <w:pStyle w:val="BodyText"/>
-      </w:pPr>
-      <w:r>
-        <w:t xml:space="preserve">2007 —</w:t>
-      </w:r>
-      <w:r>
-        <w:t xml:space="preserve"> </w:t>
-      </w:r>
-      <w:r>
-        <w:t xml:space="preserve">Society for Photographic Education, Mid-Atlantic Region Annual conference, Center for Photography at Woodstock, Woodstock, NY</w:t>
+        <w:t xml:space="preserve">2023 — Ocean Memory Project, Remembering/Writing, Friday Harbor Labs, San Juan Island, University of Washington, WA</w:t>
+      </w:r>
+    </w:p>
+    <w:p>
+      <w:pPr>
+        <w:pStyle w:val="BodyText"/>
+      </w:pPr>
+      <w:r>
+        <w:t xml:space="preserve">2022 — Ocean Memory Project, Sense Submerged Workshop, Puerto Morelos, Mexico</w:t>
+      </w:r>
+    </w:p>
+    <w:p>
+      <w:pPr>
+        <w:pStyle w:val="BodyText"/>
+      </w:pPr>
+      <w:r>
+        <w:t xml:space="preserve">2009 — Society for Photographic Education, Mid-Atlantic Region Annual conference, Montclair State University, Montclair, NJ</w:t>
+      </w:r>
+    </w:p>
+    <w:p>
+      <w:pPr>
+        <w:pStyle w:val="BodyText"/>
+      </w:pPr>
+      <w:r>
+        <w:t xml:space="preserve">2008 — Society for Photographic Education, Mid-Atlantic Region Annual conference, Carnegie Mellon University, Pittsburgh, PA</w:t>
+      </w:r>
+    </w:p>
+    <w:p>
+      <w:pPr>
+        <w:pStyle w:val="BodyText"/>
+      </w:pPr>
+      <w:r>
+        <w:t xml:space="preserve">2007 — Society for Photographic Education, Mid-Atlantic Region Annual conference, Center for Photography at Woodstock, Woodstock, NY</w:t>
       </w:r>
     </w:p>
     <w:p>
@@ -1572,13 +1524,7 @@
         <w:pStyle w:val="BodyText"/>
       </w:pPr>
       <w:r>
-        <w:t xml:space="preserve">2012 —</w:t>
-      </w:r>
-      <w:r>
-        <w:t xml:space="preserve"> </w:t>
-      </w:r>
-      <w:r>
-        <w:t xml:space="preserve">Whitecliffe College of Art and Design, Auckland, New Zealand</w:t>
+        <w:t xml:space="preserve">2012 — Whitecliffe College of Art and Design, Auckland, New Zealand</w:t>
       </w:r>
     </w:p>
     <w:p>
@@ -1598,13 +1544,7 @@
         <w:pStyle w:val="BodyText"/>
       </w:pPr>
       <w:r>
-        <w:t xml:space="preserve">2008 —</w:t>
-      </w:r>
-      <w:r>
-        <w:t xml:space="preserve"> </w:t>
-      </w:r>
-      <w:r>
-        <w:t xml:space="preserve">Photography exhibition, New Jersey Printmaking Council, Somerville, NJ</w:t>
+        <w:t xml:space="preserve">2008 — Photography exhibition, New Jersey Printmaking Council, Somerville, NJ</w:t>
       </w:r>
     </w:p>
     <w:bookmarkEnd w:id="34"/>
@@ -1647,33 +1587,7 @@
           <w:rPr>
             <w:rStyle w:val="Hyperlink"/>
           </w:rPr>
-          <w:t xml:space="preserve">Ocean Memory: Unimagined Perspectives.</w:t>
-        </w:r>
-        <w:r>
-          <w:rPr>
-            <w:rStyle w:val="Hyperlink"/>
-          </w:rPr>
-          <w:t xml:space="preserve"> </w:t>
-        </w:r>
-        <w:r>
-          <w:rPr>
-            <w:rStyle w:val="Hyperlink"/>
-            <w:iCs/>
-            <w:i/>
-          </w:rPr>
-          <w:t xml:space="preserve">Leonardo</w:t>
-        </w:r>
-        <w:r>
-          <w:rPr>
-            <w:rStyle w:val="Hyperlink"/>
-          </w:rPr>
-          <w:t xml:space="preserve"> </w:t>
-        </w:r>
-        <w:r>
-          <w:rPr>
-            <w:rStyle w:val="Hyperlink"/>
-          </w:rPr>
-          <w:t xml:space="preserve">2025; 58 (1): 105–110.</w:t>
+          <w:t xml:space="preserve">Ocean Memory: Unimagined Perspectives. Leonardo 2025; 58 (1): 105–110.</w:t>
         </w:r>
       </w:hyperlink>
     </w:p>
@@ -1908,7 +1822,7 @@
         <w:pStyle w:val="FirstParagraph"/>
       </w:pPr>
       <w:r>
-        <w:t xml:space="preserve">2008–10 —</w:t>
+        <w:t xml:space="preserve">2008–2010 —</w:t>
       </w:r>
       <w:r>
         <w:t xml:space="preserve"> </w:t>
@@ -3116,7 +3030,7 @@
         <w:t xml:space="preserve"> </w:t>
       </w:r>
       <w:r>
-        <w:t xml:space="preserve">'Giuseppe Morandi And The Lega Cultura Di Piadena Practicing Contemporary Neo-realism,' Hawaii International Conference on Arts and Humanities, University of Louisville, Honolulu, HI</w:t>
+        <w:t xml:space="preserve">'Giuseppe Morandi And The Lega Cultura Di Piadena Practicing Contemporary Neo-realism, ' Hawaii International Conference on Arts and Humanities, University of Louisville, Honolulu, HI</w:t>
       </w:r>
     </w:p>
     <w:p>
@@ -3130,7 +3044,7 @@
         <w:t xml:space="preserve"> </w:t>
       </w:r>
       <w:r>
-        <w:t xml:space="preserve">'Interstitial Languages: photography and printmaking,' Impact 4 Conference, Poznan Museum, Poland</w:t>
+        <w:t xml:space="preserve">'Interstitial Languages: photography and printmaking, ' Impact 4 Conference, Poznan Museum, Poland</w:t>
       </w:r>
     </w:p>
     <w:p>
@@ -3172,7 +3086,7 @@
         <w:t xml:space="preserve"> </w:t>
       </w:r>
       <w:r>
-        <w:t xml:space="preserve">'A history of Woodburytypes,' University of Delaware, Newark</w:t>
+        <w:t xml:space="preserve">'A history of Woodburytypes, ' University of Delaware, Newark</w:t>
       </w:r>
     </w:p>
     <w:p>
@@ -3200,7 +3114,7 @@
         <w:t xml:space="preserve"> </w:t>
       </w:r>
       <w:r>
-        <w:t xml:space="preserve">'The development of early photographic reproduction processes,' University of Virginia, Charlottesville</w:t>
+        <w:t xml:space="preserve">'The development of early photographic reproduction processes, ' University of Virginia, Charlottesville</w:t>
       </w:r>
     </w:p>
     <w:p>
@@ -3228,7 +3142,7 @@
         <w:t xml:space="preserve"> </w:t>
       </w:r>
       <w:r>
-        <w:t xml:space="preserve">'Investigating the problems of empirical research through the work of Joan Fontcuberta,' paper for CADE 2003, Hull, UK</w:t>
+        <w:t xml:space="preserve">'Investigating the problems of empirical research through the work of Joan Fontcuberta, ' paper for CADE 2003, Hull, UK</w:t>
       </w:r>
     </w:p>
     <w:p>
@@ -3242,7 +3156,7 @@
         <w:t xml:space="preserve"> </w:t>
       </w:r>
       <w:r>
-        <w:t xml:space="preserve">'Continuous Tone Alternatives to the Halftone Model Through Historical Reflection,' Paper at PICS digital imaging conference, Rochester NY</w:t>
+        <w:t xml:space="preserve">'Continuous Tone Alternatives to the Halftone Model Through Historical Reflection, ' Paper at PICS digital imaging conference, Rochester NY</w:t>
       </w:r>
     </w:p>
     <w:p>
@@ -3340,7 +3254,7 @@
         <w:t xml:space="preserve"> </w:t>
       </w:r>
       <w:r>
-        <w:t xml:space="preserve">Artists' talk during show on 'Picasso and post-war printmaking in Paris,' Arnolfini Gallery, Bristol</w:t>
+        <w:t xml:space="preserve">Artists' talk during show on 'Picasso and post-war printmaking in Paris, ' Arnolfini Gallery, Bristol</w:t>
       </w:r>
     </w:p>
     <w:p>
@@ -3599,7 +3513,7 @@
         <w:pStyle w:val="BodyText"/>
       </w:pPr>
       <w:r>
-        <w:t xml:space="preserve">updated: 5 May 2026</w:t>
+        <w:t xml:space="preserve">updated: 8 May 2026</w:t>
       </w:r>
     </w:p>
     <w:sectPr>

</xml_diff>

<commit_message>
updates: some text in the resumés
</commit_message>
<xml_diff>
--- a/docx/Atkinson_Academic.docx
+++ b/docx/Atkinson_Academic.docx
@@ -408,23 +408,23 @@
         <w:pStyle w:val="BodyText"/>
       </w:pPr>
       <w:r>
+        <w:t xml:space="preserve">Assistant Professor of Digital Photography, September 2004 – Present</w:t>
+      </w:r>
+    </w:p>
+    <w:p>
+      <w:pPr>
+        <w:pStyle w:val="BodyText"/>
+      </w:pPr>
+      <w:r>
+        <w:t xml:space="preserve">Department of Art and Design Summer Chair, Summers 2014–17, 2019–24</w:t>
+      </w:r>
+    </w:p>
+    <w:p>
+      <w:pPr>
+        <w:pStyle w:val="BodyText"/>
+      </w:pPr>
+      <w:r>
         <w:t xml:space="preserve">Deputy Chair, Dept. of Art and Design, September 2019 – May 2023</w:t>
-      </w:r>
-    </w:p>
-    <w:p>
-      <w:pPr>
-        <w:pStyle w:val="BodyText"/>
-      </w:pPr>
-      <w:r>
-        <w:t xml:space="preserve">Assistant Professor of Digital Photography, September 2004 – Present</w:t>
-      </w:r>
-    </w:p>
-    <w:p>
-      <w:pPr>
-        <w:pStyle w:val="BodyText"/>
-      </w:pPr>
-      <w:r>
-        <w:t xml:space="preserve">Department of Art and Design Summer Chair, Summers 2014–17, 2019–24</w:t>
       </w:r>
     </w:p>
     <w:p>
@@ -462,7 +462,7 @@
         <w:pStyle w:val="BodyText"/>
       </w:pPr>
       <w:r>
-        <w:t xml:space="preserve">Developed curriculum for introductory creative coding courses including for Girl Scouts and BrainPop</w:t>
+        <w:t xml:space="preserve">Collaborated with Vidcode to design and develop a three-course K–12 JavaScript curriculum that taught creative coding through project-based work, built to be accessible to non-technical teachers and adaptable across subject areas. I wrote tutorials, reviewed curriculum, aligned standards to CSTA and AP CSP frameworks, and adapted course materials for external partners including Girl Scouts USA and BrainPOP.</w:t>
       </w:r>
     </w:p>
     <w:p>
@@ -3513,7 +3513,7 @@
         <w:pStyle w:val="BodyText"/>
       </w:pPr>
       <w:r>
-        <w:t xml:space="preserve">updated: 9 May 2026</w:t>
+        <w:t xml:space="preserve">updated: 19 May 2026</w:t>
       </w:r>
     </w:p>
     <w:sectPr>

</xml_diff>